<commit_message>
Kommentaar en Fase 2 dokument
Komentaar bygesit vir top verkope oor funksionaliteit en veranderinge gemaak en inligting bygesit in my fase 2 dokument
</commit_message>
<xml_diff>
--- a/Fases_Dokumentasie/Fase2_CSS+Uitleg.docx
+++ b/Fases_Dokumentasie/Fase2_CSS+Uitleg.docx
@@ -325,10 +325,9 @@
             </w:tabs>
             <w:rPr>
               <w:rFonts w:eastAsiaTheme="minorEastAsia"/>
-              <w:noProof/>
               <w:sz w:val="24"/>
               <w:szCs w:val="24"/>
-              <w:lang w:val="en-ZA" w:eastAsia="en-ZA"/>
+              <w:lang w:eastAsia="en-ZA"/>
             </w:rPr>
           </w:pPr>
           <w:r>
@@ -346,54 +345,46 @@
                 <w:rStyle w:val="Hyperlink"/>
                 <w:b/>
                 <w:bCs/>
-                <w:noProof/>
               </w:rPr>
               <w:t>Inhoudsopgawe</w:t>
             </w:r>
             <w:r>
               <w:rPr>
-                <w:noProof/>
                 <w:webHidden/>
               </w:rPr>
               <w:tab/>
             </w:r>
             <w:r>
               <w:rPr>
-                <w:noProof/>
                 <w:webHidden/>
               </w:rPr>
               <w:fldChar w:fldCharType="begin"/>
             </w:r>
             <w:r>
               <w:rPr>
-                <w:noProof/>
                 <w:webHidden/>
               </w:rPr>
               <w:instrText xml:space="preserve"> PAGEREF _Toc224731900 \h </w:instrText>
             </w:r>
             <w:r>
               <w:rPr>
-                <w:noProof/>
                 <w:webHidden/>
               </w:rPr>
             </w:r>
             <w:r>
               <w:rPr>
-                <w:noProof/>
                 <w:webHidden/>
               </w:rPr>
               <w:fldChar w:fldCharType="separate"/>
             </w:r>
             <w:r>
               <w:rPr>
-                <w:noProof/>
                 <w:webHidden/>
               </w:rPr>
               <w:t>1</w:t>
             </w:r>
             <w:r>
               <w:rPr>
-                <w:noProof/>
                 <w:webHidden/>
               </w:rPr>
               <w:fldChar w:fldCharType="end"/>
@@ -408,10 +399,9 @@
             </w:tabs>
             <w:rPr>
               <w:rFonts w:eastAsiaTheme="minorEastAsia"/>
-              <w:noProof/>
               <w:sz w:val="24"/>
               <w:szCs w:val="24"/>
-              <w:lang w:val="en-ZA" w:eastAsia="en-ZA"/>
+              <w:lang w:eastAsia="en-ZA"/>
             </w:rPr>
           </w:pPr>
           <w:hyperlink w:anchor="_Toc224731901" w:history="1">
@@ -420,54 +410,46 @@
                 <w:rStyle w:val="Hyperlink"/>
                 <w:b/>
                 <w:bCs/>
-                <w:noProof/>
               </w:rPr>
               <w:t>Fase 2: CSS, Uitleg en Grafiese Ontwerp</w:t>
             </w:r>
             <w:r>
               <w:rPr>
-                <w:noProof/>
                 <w:webHidden/>
               </w:rPr>
               <w:tab/>
             </w:r>
             <w:r>
               <w:rPr>
-                <w:noProof/>
                 <w:webHidden/>
               </w:rPr>
               <w:fldChar w:fldCharType="begin"/>
             </w:r>
             <w:r>
               <w:rPr>
-                <w:noProof/>
                 <w:webHidden/>
               </w:rPr>
               <w:instrText xml:space="preserve"> PAGEREF _Toc224731901 \h </w:instrText>
             </w:r>
             <w:r>
               <w:rPr>
-                <w:noProof/>
                 <w:webHidden/>
               </w:rPr>
             </w:r>
             <w:r>
               <w:rPr>
-                <w:noProof/>
                 <w:webHidden/>
               </w:rPr>
               <w:fldChar w:fldCharType="separate"/>
             </w:r>
             <w:r>
               <w:rPr>
-                <w:noProof/>
                 <w:webHidden/>
               </w:rPr>
               <w:t>2</w:t>
             </w:r>
             <w:r>
               <w:rPr>
-                <w:noProof/>
                 <w:webHidden/>
               </w:rPr>
               <w:fldChar w:fldCharType="end"/>
@@ -482,64 +464,55 @@
             </w:tabs>
             <w:rPr>
               <w:rFonts w:eastAsiaTheme="minorEastAsia"/>
-              <w:noProof/>
               <w:sz w:val="24"/>
               <w:szCs w:val="24"/>
-              <w:lang w:val="en-ZA" w:eastAsia="en-ZA"/>
+              <w:lang w:eastAsia="en-ZA"/>
             </w:rPr>
           </w:pPr>
           <w:hyperlink w:anchor="_Toc224731902" w:history="1">
             <w:r>
               <w:rPr>
                 <w:rStyle w:val="Hyperlink"/>
-                <w:noProof/>
               </w:rPr>
               <w:t>CSS Verduidelikings</w:t>
             </w:r>
             <w:r>
               <w:rPr>
-                <w:noProof/>
                 <w:webHidden/>
               </w:rPr>
               <w:tab/>
             </w:r>
             <w:r>
               <w:rPr>
-                <w:noProof/>
                 <w:webHidden/>
               </w:rPr>
               <w:fldChar w:fldCharType="begin"/>
             </w:r>
             <w:r>
               <w:rPr>
-                <w:noProof/>
                 <w:webHidden/>
               </w:rPr>
               <w:instrText xml:space="preserve"> PAGEREF _Toc224731902 \h </w:instrText>
             </w:r>
             <w:r>
               <w:rPr>
-                <w:noProof/>
                 <w:webHidden/>
               </w:rPr>
             </w:r>
             <w:r>
               <w:rPr>
-                <w:noProof/>
                 <w:webHidden/>
               </w:rPr>
               <w:fldChar w:fldCharType="separate"/>
             </w:r>
             <w:r>
               <w:rPr>
-                <w:noProof/>
                 <w:webHidden/>
               </w:rPr>
               <w:t>2</w:t>
             </w:r>
             <w:r>
               <w:rPr>
-                <w:noProof/>
                 <w:webHidden/>
               </w:rPr>
               <w:fldChar w:fldCharType="end"/>
@@ -556,10 +529,9 @@
               <w:rFonts w:eastAsiaTheme="minorEastAsia"/>
               <w:i/>
               <w:iCs/>
-              <w:noProof/>
               <w:sz w:val="24"/>
               <w:szCs w:val="24"/>
-              <w:lang w:val="en-ZA" w:eastAsia="en-ZA"/>
+              <w:lang w:eastAsia="en-ZA"/>
             </w:rPr>
           </w:pPr>
           <w:hyperlink w:anchor="_Toc224731903" w:history="1">
@@ -568,7 +540,6 @@
                 <w:rStyle w:val="Hyperlink"/>
                 <w:i/>
                 <w:iCs/>
-                <w:noProof/>
               </w:rPr>
               <w:t>Globale lyf en styl</w:t>
             </w:r>
@@ -576,7 +547,6 @@
               <w:rPr>
                 <w:i/>
                 <w:iCs/>
-                <w:noProof/>
                 <w:webHidden/>
               </w:rPr>
               <w:tab/>
@@ -585,7 +555,6 @@
               <w:rPr>
                 <w:i/>
                 <w:iCs/>
-                <w:noProof/>
                 <w:webHidden/>
               </w:rPr>
               <w:fldChar w:fldCharType="begin"/>
@@ -594,7 +563,6 @@
               <w:rPr>
                 <w:i/>
                 <w:iCs/>
-                <w:noProof/>
                 <w:webHidden/>
               </w:rPr>
               <w:instrText xml:space="preserve"> PAGEREF _Toc224731903 \h </w:instrText>
@@ -603,7 +571,6 @@
               <w:rPr>
                 <w:i/>
                 <w:iCs/>
-                <w:noProof/>
                 <w:webHidden/>
               </w:rPr>
             </w:r>
@@ -611,7 +578,6 @@
               <w:rPr>
                 <w:i/>
                 <w:iCs/>
-                <w:noProof/>
                 <w:webHidden/>
               </w:rPr>
               <w:fldChar w:fldCharType="separate"/>
@@ -620,7 +586,6 @@
               <w:rPr>
                 <w:i/>
                 <w:iCs/>
-                <w:noProof/>
                 <w:webHidden/>
               </w:rPr>
               <w:t>2</w:t>
@@ -629,7 +594,6 @@
               <w:rPr>
                 <w:i/>
                 <w:iCs/>
-                <w:noProof/>
                 <w:webHidden/>
               </w:rPr>
               <w:fldChar w:fldCharType="end"/>
@@ -646,10 +610,9 @@
               <w:rFonts w:eastAsiaTheme="minorEastAsia"/>
               <w:i/>
               <w:iCs/>
-              <w:noProof/>
               <w:sz w:val="24"/>
               <w:szCs w:val="24"/>
-              <w:lang w:val="en-ZA" w:eastAsia="en-ZA"/>
+              <w:lang w:eastAsia="en-ZA"/>
             </w:rPr>
           </w:pPr>
           <w:hyperlink w:anchor="_Toc224731904" w:history="1">
@@ -658,7 +621,6 @@
                 <w:rStyle w:val="Hyperlink"/>
                 <w:i/>
                 <w:iCs/>
-                <w:noProof/>
               </w:rPr>
               <w:t>Navigasie</w:t>
             </w:r>
@@ -666,7 +628,6 @@
               <w:rPr>
                 <w:i/>
                 <w:iCs/>
-                <w:noProof/>
                 <w:webHidden/>
               </w:rPr>
               <w:tab/>
@@ -675,7 +636,6 @@
               <w:rPr>
                 <w:i/>
                 <w:iCs/>
-                <w:noProof/>
                 <w:webHidden/>
               </w:rPr>
               <w:fldChar w:fldCharType="begin"/>
@@ -684,7 +644,6 @@
               <w:rPr>
                 <w:i/>
                 <w:iCs/>
-                <w:noProof/>
                 <w:webHidden/>
               </w:rPr>
               <w:instrText xml:space="preserve"> PAGEREF _Toc224731904 \h </w:instrText>
@@ -693,7 +652,6 @@
               <w:rPr>
                 <w:i/>
                 <w:iCs/>
-                <w:noProof/>
                 <w:webHidden/>
               </w:rPr>
             </w:r>
@@ -701,7 +659,6 @@
               <w:rPr>
                 <w:i/>
                 <w:iCs/>
-                <w:noProof/>
                 <w:webHidden/>
               </w:rPr>
               <w:fldChar w:fldCharType="separate"/>
@@ -710,7 +667,6 @@
               <w:rPr>
                 <w:i/>
                 <w:iCs/>
-                <w:noProof/>
                 <w:webHidden/>
               </w:rPr>
               <w:t>2</w:t>
@@ -719,7 +675,6 @@
               <w:rPr>
                 <w:i/>
                 <w:iCs/>
-                <w:noProof/>
                 <w:webHidden/>
               </w:rPr>
               <w:fldChar w:fldCharType="end"/>
@@ -736,10 +691,9 @@
               <w:rFonts w:eastAsiaTheme="minorEastAsia"/>
               <w:i/>
               <w:iCs/>
-              <w:noProof/>
               <w:sz w:val="24"/>
               <w:szCs w:val="24"/>
-              <w:lang w:val="en-ZA" w:eastAsia="en-ZA"/>
+              <w:lang w:eastAsia="en-ZA"/>
             </w:rPr>
           </w:pPr>
           <w:hyperlink w:anchor="_Toc224731905" w:history="1">
@@ -748,7 +702,6 @@
                 <w:rStyle w:val="Hyperlink"/>
                 <w:i/>
                 <w:iCs/>
-                <w:noProof/>
               </w:rPr>
               <w:t>Knoppies</w:t>
             </w:r>
@@ -756,7 +709,6 @@
               <w:rPr>
                 <w:i/>
                 <w:iCs/>
-                <w:noProof/>
                 <w:webHidden/>
               </w:rPr>
               <w:tab/>
@@ -765,7 +717,6 @@
               <w:rPr>
                 <w:i/>
                 <w:iCs/>
-                <w:noProof/>
                 <w:webHidden/>
               </w:rPr>
               <w:fldChar w:fldCharType="begin"/>
@@ -774,7 +725,6 @@
               <w:rPr>
                 <w:i/>
                 <w:iCs/>
-                <w:noProof/>
                 <w:webHidden/>
               </w:rPr>
               <w:instrText xml:space="preserve"> PAGEREF _Toc224731905 \h </w:instrText>
@@ -783,7 +733,6 @@
               <w:rPr>
                 <w:i/>
                 <w:iCs/>
-                <w:noProof/>
                 <w:webHidden/>
               </w:rPr>
             </w:r>
@@ -791,7 +740,6 @@
               <w:rPr>
                 <w:i/>
                 <w:iCs/>
-                <w:noProof/>
                 <w:webHidden/>
               </w:rPr>
               <w:fldChar w:fldCharType="separate"/>
@@ -800,7 +748,6 @@
               <w:rPr>
                 <w:i/>
                 <w:iCs/>
-                <w:noProof/>
                 <w:webHidden/>
               </w:rPr>
               <w:t>2</w:t>
@@ -809,7 +756,6 @@
               <w:rPr>
                 <w:i/>
                 <w:iCs/>
-                <w:noProof/>
                 <w:webHidden/>
               </w:rPr>
               <w:fldChar w:fldCharType="end"/>
@@ -826,10 +772,9 @@
               <w:rFonts w:eastAsiaTheme="minorEastAsia"/>
               <w:i/>
               <w:iCs/>
-              <w:noProof/>
               <w:sz w:val="24"/>
               <w:szCs w:val="24"/>
-              <w:lang w:val="en-ZA" w:eastAsia="en-ZA"/>
+              <w:lang w:eastAsia="en-ZA"/>
             </w:rPr>
           </w:pPr>
           <w:hyperlink w:anchor="_Toc224731906" w:history="1">
@@ -838,7 +783,6 @@
                 <w:rStyle w:val="Hyperlink"/>
                 <w:i/>
                 <w:iCs/>
-                <w:noProof/>
               </w:rPr>
               <w:t>Afdelings</w:t>
             </w:r>
@@ -846,7 +790,6 @@
               <w:rPr>
                 <w:i/>
                 <w:iCs/>
-                <w:noProof/>
                 <w:webHidden/>
               </w:rPr>
               <w:tab/>
@@ -855,7 +798,6 @@
               <w:rPr>
                 <w:i/>
                 <w:iCs/>
-                <w:noProof/>
                 <w:webHidden/>
               </w:rPr>
               <w:fldChar w:fldCharType="begin"/>
@@ -864,7 +806,6 @@
               <w:rPr>
                 <w:i/>
                 <w:iCs/>
-                <w:noProof/>
                 <w:webHidden/>
               </w:rPr>
               <w:instrText xml:space="preserve"> PAGEREF _Toc224731906 \h </w:instrText>
@@ -873,7 +814,6 @@
               <w:rPr>
                 <w:i/>
                 <w:iCs/>
-                <w:noProof/>
                 <w:webHidden/>
               </w:rPr>
             </w:r>
@@ -881,7 +821,6 @@
               <w:rPr>
                 <w:i/>
                 <w:iCs/>
-                <w:noProof/>
                 <w:webHidden/>
               </w:rPr>
               <w:fldChar w:fldCharType="separate"/>
@@ -890,7 +829,6 @@
               <w:rPr>
                 <w:i/>
                 <w:iCs/>
-                <w:noProof/>
                 <w:webHidden/>
               </w:rPr>
               <w:t>2</w:t>
@@ -899,7 +837,6 @@
               <w:rPr>
                 <w:i/>
                 <w:iCs/>
-                <w:noProof/>
                 <w:webHidden/>
               </w:rPr>
               <w:fldChar w:fldCharType="end"/>
@@ -916,10 +853,9 @@
               <w:rFonts w:eastAsiaTheme="minorEastAsia"/>
               <w:i/>
               <w:iCs/>
-              <w:noProof/>
               <w:sz w:val="24"/>
               <w:szCs w:val="24"/>
-              <w:lang w:val="en-ZA" w:eastAsia="en-ZA"/>
+              <w:lang w:eastAsia="en-ZA"/>
             </w:rPr>
           </w:pPr>
           <w:hyperlink w:anchor="_Toc224731907" w:history="1">
@@ -928,7 +864,6 @@
                 <w:rStyle w:val="Hyperlink"/>
                 <w:i/>
                 <w:iCs/>
-                <w:noProof/>
               </w:rPr>
               <w:t>Tabelle</w:t>
             </w:r>
@@ -936,7 +871,6 @@
               <w:rPr>
                 <w:i/>
                 <w:iCs/>
-                <w:noProof/>
                 <w:webHidden/>
               </w:rPr>
               <w:tab/>
@@ -945,7 +879,6 @@
               <w:rPr>
                 <w:i/>
                 <w:iCs/>
-                <w:noProof/>
                 <w:webHidden/>
               </w:rPr>
               <w:fldChar w:fldCharType="begin"/>
@@ -954,7 +887,6 @@
               <w:rPr>
                 <w:i/>
                 <w:iCs/>
-                <w:noProof/>
                 <w:webHidden/>
               </w:rPr>
               <w:instrText xml:space="preserve"> PAGEREF _Toc224731907 \h </w:instrText>
@@ -963,7 +895,6 @@
               <w:rPr>
                 <w:i/>
                 <w:iCs/>
-                <w:noProof/>
                 <w:webHidden/>
               </w:rPr>
             </w:r>
@@ -971,7 +902,6 @@
               <w:rPr>
                 <w:i/>
                 <w:iCs/>
-                <w:noProof/>
                 <w:webHidden/>
               </w:rPr>
               <w:fldChar w:fldCharType="separate"/>
@@ -980,7 +910,6 @@
               <w:rPr>
                 <w:i/>
                 <w:iCs/>
-                <w:noProof/>
                 <w:webHidden/>
               </w:rPr>
               <w:t>2</w:t>
@@ -989,7 +918,6 @@
               <w:rPr>
                 <w:i/>
                 <w:iCs/>
-                <w:noProof/>
                 <w:webHidden/>
               </w:rPr>
               <w:fldChar w:fldCharType="end"/>
@@ -1006,10 +934,9 @@
               <w:rFonts w:eastAsiaTheme="minorEastAsia"/>
               <w:i/>
               <w:iCs/>
-              <w:noProof/>
               <w:sz w:val="24"/>
               <w:szCs w:val="24"/>
-              <w:lang w:val="en-ZA" w:eastAsia="en-ZA"/>
+              <w:lang w:eastAsia="en-ZA"/>
             </w:rPr>
           </w:pPr>
           <w:hyperlink w:anchor="_Toc224731908" w:history="1">
@@ -1018,7 +945,6 @@
                 <w:rStyle w:val="Hyperlink"/>
                 <w:i/>
                 <w:iCs/>
-                <w:noProof/>
               </w:rPr>
               <w:t>Gallerye en prente</w:t>
             </w:r>
@@ -1026,7 +952,6 @@
               <w:rPr>
                 <w:i/>
                 <w:iCs/>
-                <w:noProof/>
                 <w:webHidden/>
               </w:rPr>
               <w:tab/>
@@ -1035,7 +960,6 @@
               <w:rPr>
                 <w:i/>
                 <w:iCs/>
-                <w:noProof/>
                 <w:webHidden/>
               </w:rPr>
               <w:fldChar w:fldCharType="begin"/>
@@ -1044,7 +968,6 @@
               <w:rPr>
                 <w:i/>
                 <w:iCs/>
-                <w:noProof/>
                 <w:webHidden/>
               </w:rPr>
               <w:instrText xml:space="preserve"> PAGEREF _Toc224731908 \h </w:instrText>
@@ -1053,7 +976,6 @@
               <w:rPr>
                 <w:i/>
                 <w:iCs/>
-                <w:noProof/>
                 <w:webHidden/>
               </w:rPr>
             </w:r>
@@ -1061,7 +983,6 @@
               <w:rPr>
                 <w:i/>
                 <w:iCs/>
-                <w:noProof/>
                 <w:webHidden/>
               </w:rPr>
               <w:fldChar w:fldCharType="separate"/>
@@ -1070,7 +991,6 @@
               <w:rPr>
                 <w:i/>
                 <w:iCs/>
-                <w:noProof/>
                 <w:webHidden/>
               </w:rPr>
               <w:t>2</w:t>
@@ -1079,7 +999,6 @@
               <w:rPr>
                 <w:i/>
                 <w:iCs/>
-                <w:noProof/>
                 <w:webHidden/>
               </w:rPr>
               <w:fldChar w:fldCharType="end"/>
@@ -1096,10 +1015,9 @@
               <w:rFonts w:eastAsiaTheme="minorEastAsia"/>
               <w:i/>
               <w:iCs/>
-              <w:noProof/>
               <w:sz w:val="24"/>
               <w:szCs w:val="24"/>
-              <w:lang w:val="en-ZA" w:eastAsia="en-ZA"/>
+              <w:lang w:eastAsia="en-ZA"/>
             </w:rPr>
           </w:pPr>
           <w:hyperlink w:anchor="_Toc224731909" w:history="1">
@@ -1108,7 +1026,6 @@
                 <w:rStyle w:val="Hyperlink"/>
                 <w:i/>
                 <w:iCs/>
-                <w:noProof/>
               </w:rPr>
               <w:t>Kolpuntlyste</w:t>
             </w:r>
@@ -1116,7 +1033,6 @@
               <w:rPr>
                 <w:i/>
                 <w:iCs/>
-                <w:noProof/>
                 <w:webHidden/>
               </w:rPr>
               <w:tab/>
@@ -1125,7 +1041,6 @@
               <w:rPr>
                 <w:i/>
                 <w:iCs/>
-                <w:noProof/>
                 <w:webHidden/>
               </w:rPr>
               <w:fldChar w:fldCharType="begin"/>
@@ -1134,7 +1049,6 @@
               <w:rPr>
                 <w:i/>
                 <w:iCs/>
-                <w:noProof/>
                 <w:webHidden/>
               </w:rPr>
               <w:instrText xml:space="preserve"> PAGEREF _Toc224731909 \h </w:instrText>
@@ -1143,7 +1057,6 @@
               <w:rPr>
                 <w:i/>
                 <w:iCs/>
-                <w:noProof/>
                 <w:webHidden/>
               </w:rPr>
             </w:r>
@@ -1151,7 +1064,6 @@
               <w:rPr>
                 <w:i/>
                 <w:iCs/>
-                <w:noProof/>
                 <w:webHidden/>
               </w:rPr>
               <w:fldChar w:fldCharType="separate"/>
@@ -1160,7 +1072,6 @@
               <w:rPr>
                 <w:i/>
                 <w:iCs/>
-                <w:noProof/>
                 <w:webHidden/>
               </w:rPr>
               <w:t>3</w:t>
@@ -1169,7 +1080,6 @@
               <w:rPr>
                 <w:i/>
                 <w:iCs/>
-                <w:noProof/>
                 <w:webHidden/>
               </w:rPr>
               <w:fldChar w:fldCharType="end"/>
@@ -1186,10 +1096,9 @@
               <w:rFonts w:eastAsiaTheme="minorEastAsia"/>
               <w:i/>
               <w:iCs/>
-              <w:noProof/>
               <w:sz w:val="24"/>
               <w:szCs w:val="24"/>
-              <w:lang w:val="en-ZA" w:eastAsia="en-ZA"/>
+              <w:lang w:eastAsia="en-ZA"/>
             </w:rPr>
           </w:pPr>
           <w:hyperlink w:anchor="_Toc224731910" w:history="1">
@@ -1198,7 +1107,6 @@
                 <w:rStyle w:val="Hyperlink"/>
                 <w:i/>
                 <w:iCs/>
-                <w:noProof/>
               </w:rPr>
               <w:t>Webvorms</w:t>
             </w:r>
@@ -1206,7 +1114,6 @@
               <w:rPr>
                 <w:i/>
                 <w:iCs/>
-                <w:noProof/>
                 <w:webHidden/>
               </w:rPr>
               <w:tab/>
@@ -1215,7 +1122,6 @@
               <w:rPr>
                 <w:i/>
                 <w:iCs/>
-                <w:noProof/>
                 <w:webHidden/>
               </w:rPr>
               <w:fldChar w:fldCharType="begin"/>
@@ -1224,7 +1130,6 @@
               <w:rPr>
                 <w:i/>
                 <w:iCs/>
-                <w:noProof/>
                 <w:webHidden/>
               </w:rPr>
               <w:instrText xml:space="preserve"> PAGEREF _Toc224731910 \h </w:instrText>
@@ -1233,7 +1138,6 @@
               <w:rPr>
                 <w:i/>
                 <w:iCs/>
-                <w:noProof/>
                 <w:webHidden/>
               </w:rPr>
             </w:r>
@@ -1241,7 +1145,6 @@
               <w:rPr>
                 <w:i/>
                 <w:iCs/>
-                <w:noProof/>
                 <w:webHidden/>
               </w:rPr>
               <w:fldChar w:fldCharType="separate"/>
@@ -1250,7 +1153,6 @@
               <w:rPr>
                 <w:i/>
                 <w:iCs/>
-                <w:noProof/>
                 <w:webHidden/>
               </w:rPr>
               <w:t>3</w:t>
@@ -1259,7 +1161,6 @@
               <w:rPr>
                 <w:i/>
                 <w:iCs/>
-                <w:noProof/>
                 <w:webHidden/>
               </w:rPr>
               <w:fldChar w:fldCharType="end"/>
@@ -1283,7 +1184,6 @@
                 <w:rStyle w:val="Hyperlink"/>
                 <w:i/>
                 <w:iCs/>
-                <w:noProof/>
               </w:rPr>
               <w:t>Ander</w:t>
             </w:r>
@@ -1291,7 +1191,6 @@
               <w:rPr>
                 <w:i/>
                 <w:iCs/>
-                <w:noProof/>
                 <w:webHidden/>
               </w:rPr>
               <w:tab/>
@@ -1300,7 +1199,6 @@
               <w:rPr>
                 <w:i/>
                 <w:iCs/>
-                <w:noProof/>
                 <w:webHidden/>
               </w:rPr>
               <w:fldChar w:fldCharType="begin"/>
@@ -1309,7 +1207,6 @@
               <w:rPr>
                 <w:i/>
                 <w:iCs/>
-                <w:noProof/>
                 <w:webHidden/>
               </w:rPr>
               <w:instrText xml:space="preserve"> PAGEREF _Toc224731911 \h </w:instrText>
@@ -1318,7 +1215,6 @@
               <w:rPr>
                 <w:i/>
                 <w:iCs/>
-                <w:noProof/>
                 <w:webHidden/>
               </w:rPr>
             </w:r>
@@ -1326,7 +1222,6 @@
               <w:rPr>
                 <w:i/>
                 <w:iCs/>
-                <w:noProof/>
                 <w:webHidden/>
               </w:rPr>
               <w:fldChar w:fldCharType="separate"/>
@@ -1335,7 +1230,6 @@
               <w:rPr>
                 <w:i/>
                 <w:iCs/>
-                <w:noProof/>
                 <w:webHidden/>
               </w:rPr>
               <w:t>3</w:t>
@@ -1344,7 +1238,6 @@
               <w:rPr>
                 <w:i/>
                 <w:iCs/>
-                <w:noProof/>
                 <w:webHidden/>
               </w:rPr>
               <w:fldChar w:fldCharType="end"/>
@@ -1435,9 +1328,1122 @@
     <w:p>
       <w:pPr>
         <w:pStyle w:val="Heading2"/>
+        <w:jc w:val="center"/>
       </w:pPr>
       <w:bookmarkStart w:id="3" w:name="_Toc224731902"/>
       <w:r>
+        <w:t>KI genereerde prente</w:t>
+      </w:r>
+    </w:p>
+    <w:p>
+      <w:pPr>
+        <w:pStyle w:val="Heading3"/>
+      </w:pPr>
+      <w:r>
+        <w:t>Vir die volgende 5 prente het ek KI gebruik om die prente te verander of genereer:</w:t>
+      </w:r>
+    </w:p>
+    <w:p>
+      <w:pPr>
+        <w:spacing w:after="0"/>
+      </w:pPr>
+      <w:r>
+        <w:t xml:space="preserve">Ek het vir al die prente </w:t>
+      </w:r>
+      <w:r>
+        <w:rPr>
+          <w:b/>
+          <w:bCs/>
+        </w:rPr>
+        <w:t>Nano bananna AI</w:t>
+      </w:r>
+      <w:r>
+        <w:t xml:space="preserve"> gebruik hier is die URL:</w:t>
+      </w:r>
+    </w:p>
+    <w:p>
+      <w:pPr>
+        <w:rPr>
+          <w:rStyle w:val="Hyperlink"/>
+          <w:i/>
+          <w:iCs/>
+          <w:sz w:val="18"/>
+          <w:szCs w:val="18"/>
+        </w:rPr>
+      </w:pPr>
+      <w:hyperlink r:id="rId10" w:history="1">
+        <w:r>
+          <w:rPr>
+            <w:rStyle w:val="Hyperlink"/>
+            <w:i/>
+            <w:iCs/>
+            <w:sz w:val="18"/>
+            <w:szCs w:val="18"/>
+          </w:rPr>
+          <w:t>https://www.oreateai.com/home/vertical/aiImage?fr=GGSEMIMAGE&amp;gad_source=1&amp;gad_campaignid=23290921153&amp;gbraid=0AAAAA-WUEatEFOajcebRI2PxpODUNpw8X&amp;gclid=Cj0KCQjwve7NBhC-ARIsALZy9HUYdOfAoOP8D512_xIXDRguzqGhG12BmLNhOfboPkrSLNq2L9LyyEAaAhNUEALw_wcB</w:t>
+        </w:r>
+      </w:hyperlink>
+      <w:r>
+        <w:rPr>
+          <w:rStyle w:val="Hyperlink"/>
+          <w:i/>
+          <w:iCs/>
+          <w:sz w:val="18"/>
+          <w:szCs w:val="18"/>
+        </w:rPr>
+        <w:t xml:space="preserve"> </w:t>
+      </w:r>
+    </w:p>
+    <w:p>
+      <w:pPr>
+        <w:pStyle w:val="Heading3"/>
+        <w:shd w:val="clear" w:color="auto" w:fill="E8F0F8"/>
+        <w:rPr>
+          <w:sz w:val="22"/>
+          <w:szCs w:val="22"/>
+        </w:rPr>
+      </w:pPr>
+      <w:r>
+        <w:rPr>
+          <w:sz w:val="22"/>
+          <w:szCs w:val="22"/>
+        </w:rPr>
+        <w:t>Prent 1:</w:t>
+      </w:r>
+    </w:p>
+    <w:p>
+      <w:r>
+        <w:t>PlaasBoShot</w:t>
+      </w:r>
+      <w:r>
+        <w:t>.jpg</w:t>
+      </w:r>
+    </w:p>
+    <w:p>
+      <w:pPr>
+        <w:pStyle w:val="Heading4"/>
+      </w:pPr>
+      <w:r>
+        <w:t>Prompt:</w:t>
+      </w:r>
+    </w:p>
+    <w:p>
+      <w:r>
+        <w:t>Create a topdown view of a sheepfarm with free roaming sheep, must look professionaly taken and cinematic</w:t>
+      </w:r>
+    </w:p>
+    <w:p>
+      <w:pPr>
+        <w:pStyle w:val="Heading4"/>
+      </w:pPr>
+      <w:r>
+        <w:t>Gebruik</w:t>
+      </w:r>
+    </w:p>
+    <w:p>
+      <w:r>
+        <w:t>Ek het ‘n prent genereer</w:t>
+      </w:r>
+    </w:p>
+    <w:p>
+      <w:pPr>
+        <w:pStyle w:val="Heading3"/>
+        <w:shd w:val="clear" w:color="auto" w:fill="E8F0F8"/>
+        <w:rPr>
+          <w:sz w:val="22"/>
+          <w:szCs w:val="22"/>
+        </w:rPr>
+      </w:pPr>
+      <w:r>
+        <w:rPr>
+          <w:sz w:val="22"/>
+          <w:szCs w:val="22"/>
+        </w:rPr>
+        <w:t>Prent</w:t>
+      </w:r>
+      <w:r>
+        <w:rPr>
+          <w:sz w:val="22"/>
+          <w:szCs w:val="22"/>
+        </w:rPr>
+        <w:t xml:space="preserve"> 2</w:t>
+      </w:r>
+      <w:r>
+        <w:rPr>
+          <w:sz w:val="22"/>
+          <w:szCs w:val="22"/>
+        </w:rPr>
+        <w:t>:</w:t>
+      </w:r>
+    </w:p>
+    <w:p>
+      <w:r>
+        <w:t>Voorraad</w:t>
+      </w:r>
+      <w:r>
+        <w:t>.jpg</w:t>
+      </w:r>
+    </w:p>
+    <w:p>
+      <w:pPr>
+        <w:pStyle w:val="Heading4"/>
+      </w:pPr>
+      <w:r>
+        <w:t>Prompt:</w:t>
+      </w:r>
+    </w:p>
+    <w:p>
+      <w:pPr>
+        <w:pStyle w:val="ListParagraph"/>
+        <w:numPr>
+          <w:ilvl w:val="0"/>
+          <w:numId w:val="37"/>
+        </w:numPr>
+      </w:pPr>
+      <w:r>
+        <w:t>Here are all my products can you make an image featuring all of them</w:t>
+      </w:r>
+    </w:p>
+    <w:p>
+      <w:pPr>
+        <w:pStyle w:val="ListParagraph"/>
+        <w:numPr>
+          <w:ilvl w:val="0"/>
+          <w:numId w:val="37"/>
+        </w:numPr>
+      </w:pPr>
+      <w:r>
+        <w:t>Add sheepwool and sheepskin to the image</w:t>
+      </w:r>
+    </w:p>
+    <w:p>
+      <w:pPr>
+        <w:pStyle w:val="Heading4"/>
+      </w:pPr>
+      <w:r>
+        <w:t>Gebruik</w:t>
+      </w:r>
+    </w:p>
+    <w:p>
+      <w:r>
+        <w:t>My produkte fotos opgelaai en gevra om hul saam te sit in 1 prent</w:t>
+      </w:r>
+      <w:r>
+        <w:t xml:space="preserve"> </w:t>
+      </w:r>
+      <w:r>
+        <w:t>,ek het vergeet om my skaapvel en wol op te laai so toe vra ek sy genereerde prent om wol en skaapvel by te sit</w:t>
+      </w:r>
+    </w:p>
+    <w:p>
+      <w:pPr>
+        <w:pStyle w:val="Heading3"/>
+        <w:shd w:val="clear" w:color="auto" w:fill="E8F0F8"/>
+        <w:rPr>
+          <w:sz w:val="22"/>
+          <w:szCs w:val="22"/>
+        </w:rPr>
+      </w:pPr>
+      <w:r>
+        <w:rPr>
+          <w:sz w:val="22"/>
+          <w:szCs w:val="22"/>
+        </w:rPr>
+        <w:t>Prent</w:t>
+      </w:r>
+      <w:r>
+        <w:rPr>
+          <w:sz w:val="22"/>
+          <w:szCs w:val="22"/>
+        </w:rPr>
+        <w:t xml:space="preserve"> 3</w:t>
+      </w:r>
+      <w:r>
+        <w:rPr>
+          <w:sz w:val="22"/>
+          <w:szCs w:val="22"/>
+        </w:rPr>
+        <w:t>:</w:t>
+      </w:r>
+    </w:p>
+    <w:p>
+      <w:r>
+        <w:t>Voorraadbestuur.jpg</w:t>
+      </w:r>
+    </w:p>
+    <w:p>
+      <w:pPr>
+        <w:pStyle w:val="Heading4"/>
+      </w:pPr>
+      <w:r>
+        <w:t>Prompt:</w:t>
+      </w:r>
+    </w:p>
+    <w:p>
+      <w:r>
+        <w:t>Here are the products that i sell , generate an image i can use as a hero for my stock management page on my website</w:t>
+      </w:r>
+    </w:p>
+    <w:p>
+      <w:pPr>
+        <w:pStyle w:val="Heading4"/>
+      </w:pPr>
+      <w:r>
+        <w:t>Gebruik</w:t>
+      </w:r>
+    </w:p>
+    <w:p>
+      <w:r>
+        <w:t>Fotos opgelaai van my produkte en gevra om prent met hulle te genereer</w:t>
+      </w:r>
+    </w:p>
+    <w:p>
+      <w:pPr>
+        <w:pStyle w:val="Heading3"/>
+        <w:shd w:val="clear" w:color="auto" w:fill="E8F0F8"/>
+        <w:rPr>
+          <w:sz w:val="22"/>
+          <w:szCs w:val="22"/>
+        </w:rPr>
+      </w:pPr>
+      <w:r>
+        <w:rPr>
+          <w:sz w:val="22"/>
+          <w:szCs w:val="22"/>
+        </w:rPr>
+        <w:t>Prent</w:t>
+      </w:r>
+      <w:r>
+        <w:rPr>
+          <w:sz w:val="22"/>
+          <w:szCs w:val="22"/>
+        </w:rPr>
+        <w:t xml:space="preserve"> 4</w:t>
+      </w:r>
+      <w:r>
+        <w:rPr>
+          <w:sz w:val="22"/>
+          <w:szCs w:val="22"/>
+        </w:rPr>
+        <w:t>:</w:t>
+      </w:r>
+    </w:p>
+    <w:p>
+      <w:r>
+        <w:t>SkaapMis.jpg</w:t>
+      </w:r>
+    </w:p>
+    <w:p>
+      <w:pPr>
+        <w:pStyle w:val="Heading4"/>
+      </w:pPr>
+      <w:r>
+        <w:t>Prompt:</w:t>
+      </w:r>
+    </w:p>
+    <w:p>
+      <w:pPr>
+        <w:pStyle w:val="ListParagraph"/>
+        <w:numPr>
+          <w:ilvl w:val="0"/>
+          <w:numId w:val="36"/>
+        </w:numPr>
+        <w:ind w:left="360"/>
+      </w:pPr>
+      <w:r>
+        <w:t>Change the text form "Oakly Acres Farm" to "Highveld Boerdery"</w:t>
+      </w:r>
+    </w:p>
+    <w:p>
+      <w:pPr>
+        <w:pStyle w:val="ListParagraph"/>
+        <w:numPr>
+          <w:ilvl w:val="0"/>
+          <w:numId w:val="36"/>
+        </w:numPr>
+        <w:ind w:left="360"/>
+      </w:pPr>
+      <w:r>
+        <w:t>Wil you also add this as a sircle as a logo instead of the current sheep one</w:t>
+      </w:r>
+    </w:p>
+    <w:p>
+      <w:pPr>
+        <w:pStyle w:val="ListParagraph"/>
+        <w:numPr>
+          <w:ilvl w:val="0"/>
+          <w:numId w:val="36"/>
+        </w:numPr>
+        <w:ind w:left="360"/>
+      </w:pPr>
+      <w:r>
+        <w:t>Change the text "Highveld Boerdery" of the second image to look more like the first image's text "Highveld Boerdery"</w:t>
+      </w:r>
+    </w:p>
+    <w:p>
+      <w:pPr>
+        <w:pStyle w:val="Heading4"/>
+      </w:pPr>
+      <w:r>
+        <w:t>Gebruik</w:t>
+      </w:r>
+    </w:p>
+    <w:p>
+      <w:r>
+        <w:t xml:space="preserve">Ek het 3 prompts hier, eers die oorspronklike foto opgelaai en net die plaasnaam verander toe die logo verander en toe gevra om die styl te verander.Ek het na dit 2 van sy generasie saamgevoeg om </w:t>
+      </w:r>
+      <w:r>
+        <w:lastRenderedPageBreak/>
+        <w:t>die foto te kry wat ek het (ek het sy 1ste foto se teks en 3de foto se logo gebruik en saamgestel in 1 prent in, ek het hierdie self gedoen geen KI gebruik)</w:t>
+      </w:r>
+    </w:p>
+    <w:p>
+      <w:pPr>
+        <w:pStyle w:val="Heading4"/>
+      </w:pPr>
+      <w:r>
+        <w:drawing>
+          <wp:anchor distT="0" distB="0" distL="114300" distR="114300" simplePos="0" relativeHeight="251455488" behindDoc="0" locked="0" layoutInCell="1" allowOverlap="1" wp14:anchorId="022D0F97" wp14:editId="2E7B9A10">
+            <wp:simplePos x="0" y="0"/>
+            <wp:positionH relativeFrom="column">
+              <wp:posOffset>1739900</wp:posOffset>
+            </wp:positionH>
+            <wp:positionV relativeFrom="paragraph">
+              <wp:posOffset>307340</wp:posOffset>
+            </wp:positionV>
+            <wp:extent cx="1723390" cy="1524000"/>
+            <wp:effectExtent l="0" t="0" r="0" b="0"/>
+            <wp:wrapSquare wrapText="bothSides"/>
+            <wp:docPr id="39449062" name="Picture 1"/>
+            <wp:cNvGraphicFramePr>
+              <a:graphicFrameLocks xmlns:a="http://schemas.openxmlformats.org/drawingml/2006/main" noChangeAspect="1"/>
+            </wp:cNvGraphicFramePr>
+            <a:graphic xmlns:a="http://schemas.openxmlformats.org/drawingml/2006/main">
+              <a:graphicData uri="http://schemas.openxmlformats.org/drawingml/2006/picture">
+                <pic:pic xmlns:pic="http://schemas.openxmlformats.org/drawingml/2006/picture">
+                  <pic:nvPicPr>
+                    <pic:cNvPr id="39449062" name="Picture 1"/>
+                    <pic:cNvPicPr>
+                      <a:picLocks noChangeAspect="1" noChangeArrowheads="1"/>
+                    </pic:cNvPicPr>
+                  </pic:nvPicPr>
+                  <pic:blipFill>
+                    <a:blip r:embed="rId11" cstate="print">
+                      <a:extLst>
+                        <a:ext uri="{28A0092B-C50C-407E-A947-70E740481C1C}">
+                          <a14:useLocalDpi xmlns:a14="http://schemas.microsoft.com/office/drawing/2010/main" val="0"/>
+                        </a:ext>
+                      </a:extLst>
+                    </a:blip>
+                    <a:stretch>
+                      <a:fillRect/>
+                    </a:stretch>
+                  </pic:blipFill>
+                  <pic:spPr bwMode="auto">
+                    <a:xfrm>
+                      <a:off x="0" y="0"/>
+                      <a:ext cx="1723390" cy="1524000"/>
+                    </a:xfrm>
+                    <a:prstGeom prst="rect">
+                      <a:avLst/>
+                    </a:prstGeom>
+                    <a:noFill/>
+                    <a:ln>
+                      <a:noFill/>
+                    </a:ln>
+                  </pic:spPr>
+                </pic:pic>
+              </a:graphicData>
+            </a:graphic>
+            <wp14:sizeRelH relativeFrom="page">
+              <wp14:pctWidth>0</wp14:pctWidth>
+            </wp14:sizeRelH>
+            <wp14:sizeRelV relativeFrom="page">
+              <wp14:pctHeight>0</wp14:pctHeight>
+            </wp14:sizeRelV>
+          </wp:anchor>
+        </w:drawing>
+      </w:r>
+      <w:r>
+        <w:drawing>
+          <wp:anchor distT="0" distB="0" distL="114300" distR="114300" simplePos="0" relativeHeight="251438080" behindDoc="0" locked="0" layoutInCell="1" allowOverlap="1" wp14:anchorId="0B536B65" wp14:editId="1428B1AD">
+            <wp:simplePos x="0" y="0"/>
+            <wp:positionH relativeFrom="column">
+              <wp:posOffset>3763645</wp:posOffset>
+            </wp:positionH>
+            <wp:positionV relativeFrom="paragraph">
+              <wp:posOffset>309880</wp:posOffset>
+            </wp:positionV>
+            <wp:extent cx="1699260" cy="1501775"/>
+            <wp:effectExtent l="0" t="0" r="0" b="0"/>
+            <wp:wrapSquare wrapText="bothSides"/>
+            <wp:docPr id="1147916475" name="Picture 1"/>
+            <wp:cNvGraphicFramePr>
+              <a:graphicFrameLocks xmlns:a="http://schemas.openxmlformats.org/drawingml/2006/main" noChangeAspect="1"/>
+            </wp:cNvGraphicFramePr>
+            <a:graphic xmlns:a="http://schemas.openxmlformats.org/drawingml/2006/main">
+              <a:graphicData uri="http://schemas.openxmlformats.org/drawingml/2006/picture">
+                <pic:pic xmlns:pic="http://schemas.openxmlformats.org/drawingml/2006/picture">
+                  <pic:nvPicPr>
+                    <pic:cNvPr id="1147916475" name="Picture 1"/>
+                    <pic:cNvPicPr>
+                      <a:picLocks noChangeAspect="1" noChangeArrowheads="1"/>
+                    </pic:cNvPicPr>
+                  </pic:nvPicPr>
+                  <pic:blipFill>
+                    <a:blip r:embed="rId12" cstate="print">
+                      <a:extLst>
+                        <a:ext uri="{28A0092B-C50C-407E-A947-70E740481C1C}">
+                          <a14:useLocalDpi xmlns:a14="http://schemas.microsoft.com/office/drawing/2010/main" val="0"/>
+                        </a:ext>
+                      </a:extLst>
+                    </a:blip>
+                    <a:stretch>
+                      <a:fillRect/>
+                    </a:stretch>
+                  </pic:blipFill>
+                  <pic:spPr bwMode="auto">
+                    <a:xfrm>
+                      <a:off x="0" y="0"/>
+                      <a:ext cx="1699260" cy="1501775"/>
+                    </a:xfrm>
+                    <a:prstGeom prst="rect">
+                      <a:avLst/>
+                    </a:prstGeom>
+                    <a:noFill/>
+                    <a:ln>
+                      <a:noFill/>
+                    </a:ln>
+                  </pic:spPr>
+                </pic:pic>
+              </a:graphicData>
+            </a:graphic>
+            <wp14:sizeRelH relativeFrom="page">
+              <wp14:pctWidth>0</wp14:pctWidth>
+            </wp14:sizeRelH>
+            <wp14:sizeRelV relativeFrom="page">
+              <wp14:pctHeight>0</wp14:pctHeight>
+            </wp14:sizeRelV>
+          </wp:anchor>
+        </w:drawing>
+      </w:r>
+      <w:r>
+        <w:drawing>
+          <wp:anchor distT="0" distB="0" distL="114300" distR="114300" simplePos="0" relativeHeight="251472896" behindDoc="0" locked="0" layoutInCell="1" allowOverlap="1" wp14:anchorId="295C0232" wp14:editId="7C5A6FF5">
+            <wp:simplePos x="0" y="0"/>
+            <wp:positionH relativeFrom="column">
+              <wp:posOffset>0</wp:posOffset>
+            </wp:positionH>
+            <wp:positionV relativeFrom="paragraph">
+              <wp:posOffset>266700</wp:posOffset>
+            </wp:positionV>
+            <wp:extent cx="1439545" cy="1605280"/>
+            <wp:effectExtent l="0" t="0" r="0" b="0"/>
+            <wp:wrapSquare wrapText="bothSides"/>
+            <wp:docPr id="712840529" name="Picture 1"/>
+            <wp:cNvGraphicFramePr>
+              <a:graphicFrameLocks xmlns:a="http://schemas.openxmlformats.org/drawingml/2006/main" noChangeAspect="1"/>
+            </wp:cNvGraphicFramePr>
+            <a:graphic xmlns:a="http://schemas.openxmlformats.org/drawingml/2006/main">
+              <a:graphicData uri="http://schemas.openxmlformats.org/drawingml/2006/picture">
+                <pic:pic xmlns:pic="http://schemas.openxmlformats.org/drawingml/2006/picture">
+                  <pic:nvPicPr>
+                    <pic:cNvPr id="0" name="Picture 1"/>
+                    <pic:cNvPicPr>
+                      <a:picLocks noChangeAspect="1" noChangeArrowheads="1"/>
+                    </pic:cNvPicPr>
+                  </pic:nvPicPr>
+                  <pic:blipFill>
+                    <a:blip r:embed="rId13" cstate="print">
+                      <a:extLst>
+                        <a:ext uri="{28A0092B-C50C-407E-A947-70E740481C1C}">
+                          <a14:useLocalDpi xmlns:a14="http://schemas.microsoft.com/office/drawing/2010/main" val="0"/>
+                        </a:ext>
+                      </a:extLst>
+                    </a:blip>
+                    <a:srcRect/>
+                    <a:stretch>
+                      <a:fillRect/>
+                    </a:stretch>
+                  </pic:blipFill>
+                  <pic:spPr bwMode="auto">
+                    <a:xfrm>
+                      <a:off x="0" y="0"/>
+                      <a:ext cx="1439545" cy="1605280"/>
+                    </a:xfrm>
+                    <a:prstGeom prst="rect">
+                      <a:avLst/>
+                    </a:prstGeom>
+                    <a:noFill/>
+                    <a:ln>
+                      <a:noFill/>
+                    </a:ln>
+                  </pic:spPr>
+                </pic:pic>
+              </a:graphicData>
+            </a:graphic>
+            <wp14:sizeRelH relativeFrom="page">
+              <wp14:pctWidth>0</wp14:pctWidth>
+            </wp14:sizeRelH>
+            <wp14:sizeRelV relativeFrom="page">
+              <wp14:pctHeight>0</wp14:pctHeight>
+            </wp14:sizeRelV>
+          </wp:anchor>
+        </w:drawing>
+      </w:r>
+      <w:r>
+        <w:t>Hier is ook al die genereerde prente:</w:t>
+      </w:r>
+    </w:p>
+    <w:p/>
+    <w:p>
+      <w:r>
+        <w:t>| 1ste prompt se prent</w:t>
+      </w:r>
+      <w:r>
+        <w:tab/>
+      </w:r>
+      <w:r>
+        <w:t xml:space="preserve">             </w:t>
+      </w:r>
+      <w:r>
+        <w:t>| 2de promt se prent</w:t>
+      </w:r>
+      <w:r>
+        <w:tab/>
+      </w:r>
+      <w:r>
+        <w:tab/>
+      </w:r>
+      <w:r>
+        <w:t xml:space="preserve">   </w:t>
+      </w:r>
+      <w:r>
+        <w:t>| 3de promt se prent</w:t>
+      </w:r>
+    </w:p>
+    <w:p>
+      <w:pPr>
+        <w:pStyle w:val="Heading3"/>
+      </w:pPr>
+      <w:r>
+        <w:drawing>
+          <wp:anchor distT="0" distB="0" distL="114300" distR="114300" simplePos="0" relativeHeight="251712512" behindDoc="0" locked="0" layoutInCell="1" allowOverlap="1" wp14:anchorId="1947BB64" wp14:editId="22F30B4D">
+            <wp:simplePos x="0" y="0"/>
+            <wp:positionH relativeFrom="column">
+              <wp:posOffset>-487680</wp:posOffset>
+            </wp:positionH>
+            <wp:positionV relativeFrom="paragraph">
+              <wp:posOffset>1330325</wp:posOffset>
+            </wp:positionV>
+            <wp:extent cx="1439545" cy="1601470"/>
+            <wp:effectExtent l="0" t="0" r="0" b="0"/>
+            <wp:wrapTopAndBottom/>
+            <wp:docPr id="860547059" name="Picture 2"/>
+            <wp:cNvGraphicFramePr>
+              <a:graphicFrameLocks xmlns:a="http://schemas.openxmlformats.org/drawingml/2006/main" noChangeAspect="1"/>
+            </wp:cNvGraphicFramePr>
+            <a:graphic xmlns:a="http://schemas.openxmlformats.org/drawingml/2006/main">
+              <a:graphicData uri="http://schemas.openxmlformats.org/drawingml/2006/picture">
+                <pic:pic xmlns:pic="http://schemas.openxmlformats.org/drawingml/2006/picture">
+                  <pic:nvPicPr>
+                    <pic:cNvPr id="0" name="Picture 11"/>
+                    <pic:cNvPicPr>
+                      <a:picLocks noChangeAspect="1" noChangeArrowheads="1"/>
+                    </pic:cNvPicPr>
+                  </pic:nvPicPr>
+                  <pic:blipFill rotWithShape="1">
+                    <a:blip r:embed="rId14" cstate="print">
+                      <a:extLst>
+                        <a:ext uri="{28A0092B-C50C-407E-A947-70E740481C1C}">
+                          <a14:useLocalDpi xmlns:a14="http://schemas.microsoft.com/office/drawing/2010/main" val="0"/>
+                        </a:ext>
+                      </a:extLst>
+                    </a:blip>
+                    <a:srcRect t="6775" b="4233"/>
+                    <a:stretch>
+                      <a:fillRect/>
+                    </a:stretch>
+                  </pic:blipFill>
+                  <pic:spPr bwMode="auto">
+                    <a:xfrm>
+                      <a:off x="0" y="0"/>
+                      <a:ext cx="1439545" cy="1601470"/>
+                    </a:xfrm>
+                    <a:prstGeom prst="rect">
+                      <a:avLst/>
+                    </a:prstGeom>
+                    <a:noFill/>
+                    <a:ln>
+                      <a:noFill/>
+                    </a:ln>
+                    <a:extLst>
+                      <a:ext uri="{53640926-AAD7-44D8-BBD7-CCE9431645EC}">
+                        <a14:shadowObscured xmlns:a14="http://schemas.microsoft.com/office/drawing/2010/main"/>
+                      </a:ext>
+                    </a:extLst>
+                  </pic:spPr>
+                </pic:pic>
+              </a:graphicData>
+            </a:graphic>
+            <wp14:sizeRelH relativeFrom="page">
+              <wp14:pctWidth>0</wp14:pctWidth>
+            </wp14:sizeRelH>
+            <wp14:sizeRelV relativeFrom="page">
+              <wp14:pctHeight>0</wp14:pctHeight>
+            </wp14:sizeRelV>
+          </wp:anchor>
+        </w:drawing>
+      </w:r>
+      <w:r>
+        <w:drawing>
+          <wp:anchor distT="0" distB="0" distL="114300" distR="114300" simplePos="0" relativeHeight="251855872" behindDoc="0" locked="0" layoutInCell="1" allowOverlap="1" wp14:anchorId="10838533" wp14:editId="56D215A1">
+            <wp:simplePos x="0" y="0"/>
+            <wp:positionH relativeFrom="column">
+              <wp:posOffset>4396105</wp:posOffset>
+            </wp:positionH>
+            <wp:positionV relativeFrom="paragraph">
+              <wp:posOffset>1330325</wp:posOffset>
+            </wp:positionV>
+            <wp:extent cx="1828800" cy="1066800"/>
+            <wp:effectExtent l="0" t="0" r="0" b="0"/>
+            <wp:wrapTopAndBottom/>
+            <wp:docPr id="122908660" name="Picture 2"/>
+            <wp:cNvGraphicFramePr>
+              <a:graphicFrameLocks xmlns:a="http://schemas.openxmlformats.org/drawingml/2006/main" noChangeAspect="1"/>
+            </wp:cNvGraphicFramePr>
+            <a:graphic xmlns:a="http://schemas.openxmlformats.org/drawingml/2006/main">
+              <a:graphicData uri="http://schemas.openxmlformats.org/drawingml/2006/picture">
+                <pic:pic xmlns:pic="http://schemas.openxmlformats.org/drawingml/2006/picture">
+                  <pic:nvPicPr>
+                    <pic:cNvPr id="122908660" name="Picture 2"/>
+                    <pic:cNvPicPr>
+                      <a:picLocks noChangeAspect="1" noChangeArrowheads="1"/>
+                    </pic:cNvPicPr>
+                  </pic:nvPicPr>
+                  <pic:blipFill>
+                    <a:blip r:embed="rId15" cstate="print">
+                      <a:extLst>
+                        <a:ext uri="{28A0092B-C50C-407E-A947-70E740481C1C}">
+                          <a14:useLocalDpi xmlns:a14="http://schemas.microsoft.com/office/drawing/2010/main" val="0"/>
+                        </a:ext>
+                      </a:extLst>
+                    </a:blip>
+                    <a:stretch>
+                      <a:fillRect/>
+                    </a:stretch>
+                  </pic:blipFill>
+                  <pic:spPr bwMode="auto">
+                    <a:xfrm>
+                      <a:off x="0" y="0"/>
+                      <a:ext cx="1828800" cy="1066800"/>
+                    </a:xfrm>
+                    <a:prstGeom prst="rect">
+                      <a:avLst/>
+                    </a:prstGeom>
+                    <a:noFill/>
+                  </pic:spPr>
+                </pic:pic>
+              </a:graphicData>
+            </a:graphic>
+            <wp14:sizeRelH relativeFrom="page">
+              <wp14:pctWidth>0</wp14:pctWidth>
+            </wp14:sizeRelH>
+            <wp14:sizeRelV relativeFrom="page">
+              <wp14:pctHeight>0</wp14:pctHeight>
+            </wp14:sizeRelV>
+          </wp:anchor>
+        </w:drawing>
+      </w:r>
+      <w:r>
+        <w:drawing>
+          <wp:anchor distT="0" distB="0" distL="114300" distR="114300" simplePos="0" relativeHeight="251820032" behindDoc="0" locked="0" layoutInCell="1" allowOverlap="1" wp14:anchorId="0B912BFC" wp14:editId="6DBDF97F">
+            <wp:simplePos x="0" y="0"/>
+            <wp:positionH relativeFrom="column">
+              <wp:posOffset>1135380</wp:posOffset>
+            </wp:positionH>
+            <wp:positionV relativeFrom="paragraph">
+              <wp:posOffset>1330325</wp:posOffset>
+            </wp:positionV>
+            <wp:extent cx="1439545" cy="1601470"/>
+            <wp:effectExtent l="0" t="0" r="0" b="0"/>
+            <wp:wrapTopAndBottom/>
+            <wp:docPr id="1275877662" name="Picture 2"/>
+            <wp:cNvGraphicFramePr>
+              <a:graphicFrameLocks xmlns:a="http://schemas.openxmlformats.org/drawingml/2006/main" noChangeAspect="1"/>
+            </wp:cNvGraphicFramePr>
+            <a:graphic xmlns:a="http://schemas.openxmlformats.org/drawingml/2006/main">
+              <a:graphicData uri="http://schemas.openxmlformats.org/drawingml/2006/picture">
+                <pic:pic xmlns:pic="http://schemas.openxmlformats.org/drawingml/2006/picture">
+                  <pic:nvPicPr>
+                    <pic:cNvPr id="1275877662" name="Picture 2"/>
+                    <pic:cNvPicPr>
+                      <a:picLocks noChangeAspect="1" noChangeArrowheads="1"/>
+                    </pic:cNvPicPr>
+                  </pic:nvPicPr>
+                  <pic:blipFill>
+                    <a:blip r:embed="rId16" cstate="print">
+                      <a:extLst>
+                        <a:ext uri="{28A0092B-C50C-407E-A947-70E740481C1C}">
+                          <a14:useLocalDpi xmlns:a14="http://schemas.microsoft.com/office/drawing/2010/main" val="0"/>
+                        </a:ext>
+                      </a:extLst>
+                    </a:blip>
+                    <a:stretch>
+                      <a:fillRect/>
+                    </a:stretch>
+                  </pic:blipFill>
+                  <pic:spPr bwMode="auto">
+                    <a:xfrm>
+                      <a:off x="0" y="0"/>
+                      <a:ext cx="1439545" cy="1601470"/>
+                    </a:xfrm>
+                    <a:prstGeom prst="rect">
+                      <a:avLst/>
+                    </a:prstGeom>
+                    <a:noFill/>
+                  </pic:spPr>
+                </pic:pic>
+              </a:graphicData>
+            </a:graphic>
+            <wp14:sizeRelH relativeFrom="page">
+              <wp14:pctWidth>0</wp14:pctWidth>
+            </wp14:sizeRelH>
+            <wp14:sizeRelV relativeFrom="page">
+              <wp14:pctHeight>0</wp14:pctHeight>
+            </wp14:sizeRelV>
+          </wp:anchor>
+        </w:drawing>
+      </w:r>
+      <w:r>
+        <w:drawing>
+          <wp:anchor distT="0" distB="0" distL="114300" distR="114300" simplePos="0" relativeHeight="251765760" behindDoc="0" locked="0" layoutInCell="1" allowOverlap="1" wp14:anchorId="68B92414" wp14:editId="2C197F70">
+            <wp:simplePos x="0" y="0"/>
+            <wp:positionH relativeFrom="column">
+              <wp:posOffset>2758440</wp:posOffset>
+            </wp:positionH>
+            <wp:positionV relativeFrom="paragraph">
+              <wp:posOffset>1330325</wp:posOffset>
+            </wp:positionV>
+            <wp:extent cx="1439545" cy="1339850"/>
+            <wp:effectExtent l="0" t="0" r="0" b="0"/>
+            <wp:wrapTopAndBottom/>
+            <wp:docPr id="1820809241" name="Picture 2"/>
+            <wp:cNvGraphicFramePr>
+              <a:graphicFrameLocks xmlns:a="http://schemas.openxmlformats.org/drawingml/2006/main" noChangeAspect="1"/>
+            </wp:cNvGraphicFramePr>
+            <a:graphic xmlns:a="http://schemas.openxmlformats.org/drawingml/2006/main">
+              <a:graphicData uri="http://schemas.openxmlformats.org/drawingml/2006/picture">
+                <pic:pic xmlns:pic="http://schemas.openxmlformats.org/drawingml/2006/picture">
+                  <pic:nvPicPr>
+                    <pic:cNvPr id="1820809241" name="Picture 2"/>
+                    <pic:cNvPicPr>
+                      <a:picLocks noChangeAspect="1" noChangeArrowheads="1"/>
+                    </pic:cNvPicPr>
+                  </pic:nvPicPr>
+                  <pic:blipFill>
+                    <a:blip r:embed="rId17" cstate="print">
+                      <a:extLst>
+                        <a:ext uri="{28A0092B-C50C-407E-A947-70E740481C1C}">
+                          <a14:useLocalDpi xmlns:a14="http://schemas.microsoft.com/office/drawing/2010/main" val="0"/>
+                        </a:ext>
+                      </a:extLst>
+                    </a:blip>
+                    <a:stretch>
+                      <a:fillRect/>
+                    </a:stretch>
+                  </pic:blipFill>
+                  <pic:spPr bwMode="auto">
+                    <a:xfrm>
+                      <a:off x="0" y="0"/>
+                      <a:ext cx="1439545" cy="1339850"/>
+                    </a:xfrm>
+                    <a:prstGeom prst="rect">
+                      <a:avLst/>
+                    </a:prstGeom>
+                    <a:noFill/>
+                  </pic:spPr>
+                </pic:pic>
+              </a:graphicData>
+            </a:graphic>
+            <wp14:sizeRelH relativeFrom="page">
+              <wp14:pctWidth>0</wp14:pctWidth>
+            </wp14:sizeRelH>
+            <wp14:sizeRelV relativeFrom="page">
+              <wp14:pctHeight>0</wp14:pctHeight>
+            </wp14:sizeRelV>
+          </wp:anchor>
+        </w:drawing>
+      </w:r>
+      <w:r>
+        <w:drawing>
+          <wp:anchor distT="0" distB="0" distL="114300" distR="114300" simplePos="0" relativeHeight="251526144" behindDoc="0" locked="0" layoutInCell="1" allowOverlap="1" wp14:anchorId="76FDE99A" wp14:editId="1665D10C">
+            <wp:simplePos x="0" y="0"/>
+            <wp:positionH relativeFrom="column">
+              <wp:posOffset>-281940</wp:posOffset>
+            </wp:positionH>
+            <wp:positionV relativeFrom="paragraph">
+              <wp:posOffset>286385</wp:posOffset>
+            </wp:positionV>
+            <wp:extent cx="1439545" cy="883920"/>
+            <wp:effectExtent l="0" t="0" r="0" b="0"/>
+            <wp:wrapTopAndBottom/>
+            <wp:docPr id="427363878" name="Picture 1"/>
+            <wp:cNvGraphicFramePr>
+              <a:graphicFrameLocks xmlns:a="http://schemas.openxmlformats.org/drawingml/2006/main" noChangeAspect="1"/>
+            </wp:cNvGraphicFramePr>
+            <a:graphic xmlns:a="http://schemas.openxmlformats.org/drawingml/2006/main">
+              <a:graphicData uri="http://schemas.openxmlformats.org/drawingml/2006/picture">
+                <pic:pic xmlns:pic="http://schemas.openxmlformats.org/drawingml/2006/picture">
+                  <pic:nvPicPr>
+                    <pic:cNvPr id="427363878" name="Picture 1"/>
+                    <pic:cNvPicPr>
+                      <a:picLocks noChangeAspect="1" noChangeArrowheads="1"/>
+                    </pic:cNvPicPr>
+                  </pic:nvPicPr>
+                  <pic:blipFill rotWithShape="1">
+                    <a:blip r:embed="rId18" cstate="print">
+                      <a:extLst>
+                        <a:ext uri="{28A0092B-C50C-407E-A947-70E740481C1C}">
+                          <a14:useLocalDpi xmlns:a14="http://schemas.microsoft.com/office/drawing/2010/main" val="0"/>
+                        </a:ext>
+                      </a:extLst>
+                    </a:blip>
+                    <a:srcRect b="7875"/>
+                    <a:stretch>
+                      <a:fillRect/>
+                    </a:stretch>
+                  </pic:blipFill>
+                  <pic:spPr bwMode="auto">
+                    <a:xfrm>
+                      <a:off x="0" y="0"/>
+                      <a:ext cx="1439545" cy="883920"/>
+                    </a:xfrm>
+                    <a:prstGeom prst="rect">
+                      <a:avLst/>
+                    </a:prstGeom>
+                    <a:noFill/>
+                    <a:ln>
+                      <a:noFill/>
+                    </a:ln>
+                    <a:extLst>
+                      <a:ext uri="{53640926-AAD7-44D8-BBD7-CCE9431645EC}">
+                        <a14:shadowObscured xmlns:a14="http://schemas.microsoft.com/office/drawing/2010/main"/>
+                      </a:ext>
+                    </a:extLst>
+                  </pic:spPr>
+                </pic:pic>
+              </a:graphicData>
+            </a:graphic>
+            <wp14:sizeRelH relativeFrom="page">
+              <wp14:pctWidth>0</wp14:pctWidth>
+            </wp14:sizeRelH>
+            <wp14:sizeRelV relativeFrom="page">
+              <wp14:pctHeight>0</wp14:pctHeight>
+            </wp14:sizeRelV>
+          </wp:anchor>
+        </w:drawing>
+      </w:r>
+      <w:r>
+        <w:drawing>
+          <wp:anchor distT="0" distB="0" distL="114300" distR="114300" simplePos="0" relativeHeight="251678720" behindDoc="0" locked="0" layoutInCell="1" allowOverlap="1" wp14:anchorId="7F8DCF89" wp14:editId="5B11882F">
+            <wp:simplePos x="0" y="0"/>
+            <wp:positionH relativeFrom="column">
+              <wp:posOffset>4572000</wp:posOffset>
+            </wp:positionH>
+            <wp:positionV relativeFrom="paragraph">
+              <wp:posOffset>286385</wp:posOffset>
+            </wp:positionV>
+            <wp:extent cx="1439545" cy="901065"/>
+            <wp:effectExtent l="0" t="0" r="0" b="0"/>
+            <wp:wrapTopAndBottom/>
+            <wp:docPr id="1660398502" name="Picture 1"/>
+            <wp:cNvGraphicFramePr>
+              <a:graphicFrameLocks xmlns:a="http://schemas.openxmlformats.org/drawingml/2006/main" noChangeAspect="1"/>
+            </wp:cNvGraphicFramePr>
+            <a:graphic xmlns:a="http://schemas.openxmlformats.org/drawingml/2006/main">
+              <a:graphicData uri="http://schemas.openxmlformats.org/drawingml/2006/picture">
+                <pic:pic xmlns:pic="http://schemas.openxmlformats.org/drawingml/2006/picture">
+                  <pic:nvPicPr>
+                    <pic:cNvPr id="1660398502" name="Picture 1"/>
+                    <pic:cNvPicPr>
+                      <a:picLocks noChangeAspect="1" noChangeArrowheads="1"/>
+                    </pic:cNvPicPr>
+                  </pic:nvPicPr>
+                  <pic:blipFill>
+                    <a:blip r:embed="rId19" cstate="print">
+                      <a:extLst>
+                        <a:ext uri="{28A0092B-C50C-407E-A947-70E740481C1C}">
+                          <a14:useLocalDpi xmlns:a14="http://schemas.microsoft.com/office/drawing/2010/main" val="0"/>
+                        </a:ext>
+                      </a:extLst>
+                    </a:blip>
+                    <a:stretch>
+                      <a:fillRect/>
+                    </a:stretch>
+                  </pic:blipFill>
+                  <pic:spPr bwMode="auto">
+                    <a:xfrm>
+                      <a:off x="0" y="0"/>
+                      <a:ext cx="1439545" cy="901065"/>
+                    </a:xfrm>
+                    <a:prstGeom prst="rect">
+                      <a:avLst/>
+                    </a:prstGeom>
+                    <a:noFill/>
+                    <a:ln>
+                      <a:noFill/>
+                    </a:ln>
+                  </pic:spPr>
+                </pic:pic>
+              </a:graphicData>
+            </a:graphic>
+            <wp14:sizeRelH relativeFrom="page">
+              <wp14:pctWidth>0</wp14:pctWidth>
+            </wp14:sizeRelH>
+            <wp14:sizeRelV relativeFrom="page">
+              <wp14:pctHeight>0</wp14:pctHeight>
+            </wp14:sizeRelV>
+          </wp:anchor>
+        </w:drawing>
+      </w:r>
+      <w:r>
+        <w:drawing>
+          <wp:anchor distT="0" distB="0" distL="114300" distR="114300" simplePos="0" relativeHeight="251628544" behindDoc="0" locked="0" layoutInCell="1" allowOverlap="1" wp14:anchorId="0A3708AA" wp14:editId="4AA25036">
+            <wp:simplePos x="0" y="0"/>
+            <wp:positionH relativeFrom="column">
+              <wp:posOffset>2956560</wp:posOffset>
+            </wp:positionH>
+            <wp:positionV relativeFrom="paragraph">
+              <wp:posOffset>278765</wp:posOffset>
+            </wp:positionV>
+            <wp:extent cx="1439545" cy="841375"/>
+            <wp:effectExtent l="0" t="0" r="0" b="0"/>
+            <wp:wrapTopAndBottom/>
+            <wp:docPr id="1291504718" name="Picture 1"/>
+            <wp:cNvGraphicFramePr>
+              <a:graphicFrameLocks xmlns:a="http://schemas.openxmlformats.org/drawingml/2006/main" noChangeAspect="1"/>
+            </wp:cNvGraphicFramePr>
+            <a:graphic xmlns:a="http://schemas.openxmlformats.org/drawingml/2006/main">
+              <a:graphicData uri="http://schemas.openxmlformats.org/drawingml/2006/picture">
+                <pic:pic xmlns:pic="http://schemas.openxmlformats.org/drawingml/2006/picture">
+                  <pic:nvPicPr>
+                    <pic:cNvPr id="1291504718" name="Picture 1"/>
+                    <pic:cNvPicPr>
+                      <a:picLocks noChangeAspect="1" noChangeArrowheads="1"/>
+                    </pic:cNvPicPr>
+                  </pic:nvPicPr>
+                  <pic:blipFill>
+                    <a:blip r:embed="rId20" cstate="print">
+                      <a:extLst>
+                        <a:ext uri="{28A0092B-C50C-407E-A947-70E740481C1C}">
+                          <a14:useLocalDpi xmlns:a14="http://schemas.microsoft.com/office/drawing/2010/main" val="0"/>
+                        </a:ext>
+                      </a:extLst>
+                    </a:blip>
+                    <a:stretch>
+                      <a:fillRect/>
+                    </a:stretch>
+                  </pic:blipFill>
+                  <pic:spPr bwMode="auto">
+                    <a:xfrm>
+                      <a:off x="0" y="0"/>
+                      <a:ext cx="1439545" cy="841375"/>
+                    </a:xfrm>
+                    <a:prstGeom prst="rect">
+                      <a:avLst/>
+                    </a:prstGeom>
+                    <a:noFill/>
+                    <a:ln>
+                      <a:noFill/>
+                    </a:ln>
+                  </pic:spPr>
+                </pic:pic>
+              </a:graphicData>
+            </a:graphic>
+            <wp14:sizeRelH relativeFrom="page">
+              <wp14:pctWidth>0</wp14:pctWidth>
+            </wp14:sizeRelH>
+            <wp14:sizeRelV relativeFrom="page">
+              <wp14:pctHeight>0</wp14:pctHeight>
+            </wp14:sizeRelV>
+          </wp:anchor>
+        </w:drawing>
+      </w:r>
+      <w:r>
+        <w:drawing>
+          <wp:anchor distT="0" distB="0" distL="114300" distR="114300" simplePos="0" relativeHeight="251577344" behindDoc="0" locked="0" layoutInCell="1" allowOverlap="1" wp14:anchorId="0CE5A8AA" wp14:editId="4FEBF8FD">
+            <wp:simplePos x="0" y="0"/>
+            <wp:positionH relativeFrom="column">
+              <wp:posOffset>1333500</wp:posOffset>
+            </wp:positionH>
+            <wp:positionV relativeFrom="paragraph">
+              <wp:posOffset>286385</wp:posOffset>
+            </wp:positionV>
+            <wp:extent cx="1439545" cy="901065"/>
+            <wp:effectExtent l="0" t="0" r="0" b="0"/>
+            <wp:wrapTopAndBottom/>
+            <wp:docPr id="61056706" name="Picture 1"/>
+            <wp:cNvGraphicFramePr>
+              <a:graphicFrameLocks xmlns:a="http://schemas.openxmlformats.org/drawingml/2006/main" noChangeAspect="1"/>
+            </wp:cNvGraphicFramePr>
+            <a:graphic xmlns:a="http://schemas.openxmlformats.org/drawingml/2006/main">
+              <a:graphicData uri="http://schemas.openxmlformats.org/drawingml/2006/picture">
+                <pic:pic xmlns:pic="http://schemas.openxmlformats.org/drawingml/2006/picture">
+                  <pic:nvPicPr>
+                    <pic:cNvPr id="61056706" name="Picture 1"/>
+                    <pic:cNvPicPr>
+                      <a:picLocks noChangeAspect="1" noChangeArrowheads="1"/>
+                    </pic:cNvPicPr>
+                  </pic:nvPicPr>
+                  <pic:blipFill>
+                    <a:blip r:embed="rId21" cstate="print">
+                      <a:extLst>
+                        <a:ext uri="{28A0092B-C50C-407E-A947-70E740481C1C}">
+                          <a14:useLocalDpi xmlns:a14="http://schemas.microsoft.com/office/drawing/2010/main" val="0"/>
+                        </a:ext>
+                      </a:extLst>
+                    </a:blip>
+                    <a:stretch>
+                      <a:fillRect/>
+                    </a:stretch>
+                  </pic:blipFill>
+                  <pic:spPr bwMode="auto">
+                    <a:xfrm>
+                      <a:off x="0" y="0"/>
+                      <a:ext cx="1439545" cy="901065"/>
+                    </a:xfrm>
+                    <a:prstGeom prst="rect">
+                      <a:avLst/>
+                    </a:prstGeom>
+                    <a:noFill/>
+                    <a:ln>
+                      <a:noFill/>
+                    </a:ln>
+                  </pic:spPr>
+                </pic:pic>
+              </a:graphicData>
+            </a:graphic>
+            <wp14:sizeRelH relativeFrom="page">
+              <wp14:pctWidth>0</wp14:pctWidth>
+            </wp14:sizeRelH>
+            <wp14:sizeRelV relativeFrom="page">
+              <wp14:pctHeight>0</wp14:pctHeight>
+            </wp14:sizeRelV>
+          </wp:anchor>
+        </w:drawing>
+      </w:r>
+      <w:r>
+        <w:t>Prente gebruik in en vir die genereering:</w:t>
+      </w:r>
+    </w:p>
+    <w:p/>
+    <w:p>
+      <w:pPr>
+        <w:pStyle w:val="Heading2"/>
+        <w:jc w:val="center"/>
+      </w:pPr>
+      <w:r>
         <w:t>CSS Verduidelikings</w:t>
       </w:r>
       <w:bookmarkEnd w:id="3"/>
@@ -1482,6 +2488,7 @@
       </w:pPr>
       <w:bookmarkStart w:id="5" w:name="_Toc224731904"/>
       <w:r>
+        <w:lastRenderedPageBreak/>
         <w:t>Navigasie</w:t>
       </w:r>
       <w:bookmarkEnd w:id="5"/>
@@ -1616,7 +2623,6 @@
     </w:p>
     <w:p>
       <w:r>
-        <w:lastRenderedPageBreak/>
         <w:tab/>
         <w:t>Dropbtn</w:t>
       </w:r>
@@ -1698,6 +2704,7 @@
       </w:pPr>
       <w:bookmarkStart w:id="6" w:name="_Toc224731905"/>
       <w:r>
+        <w:lastRenderedPageBreak/>
         <w:t>Knoppies</w:t>
       </w:r>
       <w:bookmarkEnd w:id="6"/>
@@ -1711,23 +2718,63 @@
       </w:r>
     </w:p>
     <w:p>
-      <w:r>
-        <w:t>Cta</w:t>
-      </w:r>
-    </w:p>
-    <w:p>
-      <w:r>
-        <w:t>Cta h2</w:t>
-      </w:r>
-    </w:p>
-    <w:p>
-      <w:r>
-        <w:t>Cta button, afdeling button</w:t>
-      </w:r>
-    </w:p>
-    <w:p>
-      <w:r>
-        <w:t>Cta button hover</w:t>
+      <w:pPr>
+        <w:pStyle w:val="ListParagraph"/>
+        <w:numPr>
+          <w:ilvl w:val="0"/>
+          <w:numId w:val="38"/>
+        </w:numPr>
+      </w:pPr>
+      <w:r>
+        <w:t>Ek het ’n spesiale knoppie-klas ontwerp vir oproepe tot aksie (.cta).</w:t>
+      </w:r>
+    </w:p>
+    <w:p>
+      <w:pPr>
+        <w:pStyle w:val="ListParagraph"/>
+        <w:numPr>
+          <w:ilvl w:val="0"/>
+          <w:numId w:val="38"/>
+        </w:numPr>
+      </w:pPr>
+      <w:r>
+        <w:t>Ek het die agtergrond donkergroen gemaak, die teks wit, die blokie rond gemaak (border-radius: 6px) en die knoppie sentreer.</w:t>
+      </w:r>
+    </w:p>
+    <w:p>
+      <w:pPr>
+        <w:pStyle w:val="ListParagraph"/>
+        <w:numPr>
+          <w:ilvl w:val="0"/>
+          <w:numId w:val="38"/>
+        </w:numPr>
+      </w:pPr>
+      <w:r>
+        <w:t>Ek het ook die h2 binne die blok wit gemaak (.cta h2) sodat die opskrif mooi by die groen agtergrond pas.</w:t>
+      </w:r>
+    </w:p>
+    <w:p>
+      <w:pPr>
+        <w:pStyle w:val="ListParagraph"/>
+        <w:numPr>
+          <w:ilvl w:val="0"/>
+          <w:numId w:val="38"/>
+        </w:numPr>
+      </w:pPr>
+      <w:r>
+        <w:t>Ek het dieselfde knoppie-styl binne alle .cta en .afdeling klasse hergebruik (cta button, .afdeling button) sodat elke “Besoek ons vandag” of “Kontak Ons”-knoppie dieselfde lyk.</w:t>
+      </w:r>
+    </w:p>
+    <w:p>
+      <w:pPr>
+        <w:pStyle w:val="ListParagraph"/>
+        <w:numPr>
+          <w:ilvl w:val="0"/>
+          <w:numId w:val="38"/>
+        </w:numPr>
+      </w:pPr>
+      <w:r>
+        <w:t>Wanneer die muis daaroor beweeg (.cta button:hover), verander die kleur na ’n donkerder groen vir ’n mooi hover-effek.</w:t>
       </w:r>
     </w:p>
     <w:p>
@@ -1832,71 +2879,209 @@
         <w:pStyle w:val="Heading4"/>
       </w:pPr>
       <w:r>
+        <w:t>Tuisblad inleiding</w:t>
+      </w:r>
+    </w:p>
+    <w:p>
+      <w:r>
+        <w:t>Intro</w:t>
+      </w:r>
+    </w:p>
+    <w:p>
+      <w:r>
+        <w:t>Intro p</w:t>
+      </w:r>
+    </w:p>
+    <w:p>
+      <w:r>
+        <w:t>Intro before</w:t>
+      </w:r>
+    </w:p>
+    <w:p>
+      <w:pPr>
+        <w:pStyle w:val="Heading3"/>
+      </w:pPr>
+      <w:bookmarkStart w:id="8" w:name="_Toc224731907"/>
+      <w:r>
+        <w:t>Tabelle</w:t>
+      </w:r>
+      <w:bookmarkEnd w:id="8"/>
+    </w:p>
+    <w:p>
+      <w:pPr>
+        <w:pStyle w:val="Heading4"/>
+      </w:pPr>
+      <w:r>
+        <w:t>Tabelle</w:t>
+      </w:r>
+    </w:p>
+    <w:p>
+      <w:r>
+        <w:t>Table</w:t>
+      </w:r>
+    </w:p>
+    <w:p>
+      <w:r>
+        <w:t>Thead</w:t>
+      </w:r>
+    </w:p>
+    <w:p>
+      <w:r>
+        <w:t>Th, td</w:t>
+      </w:r>
+    </w:p>
+    <w:p>
+      <w:r>
+        <w:t>Th</w:t>
+      </w:r>
+    </w:p>
+    <w:p>
+      <w:r>
         <w:lastRenderedPageBreak/>
-        <w:t>Tuisblad inleiding</w:t>
-      </w:r>
-    </w:p>
-    <w:p>
-      <w:r>
-        <w:t>Intro</w:t>
-      </w:r>
-    </w:p>
-    <w:p>
-      <w:r>
-        <w:t>Intro p</w:t>
-      </w:r>
-    </w:p>
-    <w:p>
-      <w:r>
-        <w:t>Intro before</w:t>
+        <w:t>Td</w:t>
+      </w:r>
+    </w:p>
+    <w:p>
+      <w:r>
+        <w:t>Tr last child</w:t>
+      </w:r>
+    </w:p>
+    <w:p>
+      <w:pPr>
+        <w:pStyle w:val="Heading4"/>
+      </w:pPr>
+      <w:r>
+        <w:t>Prys</w:t>
+      </w:r>
+    </w:p>
+    <w:p>
+      <w:r>
+        <w:t>Price</w:t>
+      </w:r>
+    </w:p>
+    <w:p>
+      <w:pPr>
+        <w:pStyle w:val="Heading4"/>
+      </w:pPr>
+      <w:r>
+        <w:t>Lae voorraad waarsku</w:t>
+      </w:r>
+    </w:p>
+    <w:p>
+      <w:r>
+        <w:t>Low stock row</w:t>
+      </w:r>
+    </w:p>
+    <w:p>
+      <w:r>
+        <w:t>Low stock emphasis</w:t>
+      </w:r>
+    </w:p>
+    <w:p>
+      <w:r>
+        <w:t>Status low</w:t>
+      </w:r>
+    </w:p>
+    <w:p>
+      <w:pPr>
+        <w:pStyle w:val="Heading4"/>
+      </w:pPr>
+      <w:r>
+        <w:t>Soekveld en invoeg</w:t>
+      </w:r>
+    </w:p>
+    <w:p>
+      <w:r>
+        <w:t>Controls</w:t>
+      </w:r>
+    </w:p>
+    <w:p>
+      <w:r>
+        <w:t>Input</w:t>
+      </w:r>
+    </w:p>
+    <w:p>
+      <w:r>
+        <w:t>Button add btn</w:t>
+      </w:r>
+    </w:p>
+    <w:p>
+      <w:r>
+        <w:t>Button add btn hover</w:t>
       </w:r>
     </w:p>
     <w:p>
       <w:pPr>
         <w:pStyle w:val="Heading3"/>
       </w:pPr>
-      <w:bookmarkStart w:id="8" w:name="_Toc224731907"/>
-      <w:r>
-        <w:t>Tabelle</w:t>
-      </w:r>
-      <w:bookmarkEnd w:id="8"/>
+      <w:bookmarkStart w:id="9" w:name="_Toc224731908"/>
+      <w:r>
+        <w:t>Gallerye</w:t>
+      </w:r>
+      <w:r>
+        <w:t xml:space="preserve"> en prente</w:t>
+      </w:r>
+      <w:bookmarkEnd w:id="9"/>
     </w:p>
     <w:p>
       <w:pPr>
         <w:pStyle w:val="Heading4"/>
       </w:pPr>
       <w:r>
-        <w:t>Tabelle</w:t>
-      </w:r>
-    </w:p>
-    <w:p>
-      <w:r>
-        <w:t>Table</w:t>
-      </w:r>
-    </w:p>
-    <w:p>
-      <w:r>
-        <w:t>Thead</w:t>
-      </w:r>
-    </w:p>
-    <w:p>
-      <w:r>
-        <w:t>Th, td</w:t>
-      </w:r>
-    </w:p>
-    <w:p>
-      <w:r>
-        <w:t>Th</w:t>
-      </w:r>
-    </w:p>
-    <w:p>
-      <w:r>
-        <w:t>Td</w:t>
-      </w:r>
-    </w:p>
-    <w:p>
-      <w:r>
-        <w:t>Tr last child</w:t>
+        <w:t>Galery</w:t>
+      </w:r>
+      <w:r>
+        <w:t xml:space="preserve"> - Tuisblad</w:t>
+      </w:r>
+    </w:p>
+    <w:p>
+      <w:r>
+        <w:t>Gallery</w:t>
+      </w:r>
+    </w:p>
+    <w:p>
+      <w:r>
+        <w:t>Slide</w:t>
+      </w:r>
+    </w:p>
+    <w:p>
+      <w:r>
+        <w:t>Slide active</w:t>
+      </w:r>
+    </w:p>
+    <w:p>
+      <w:r>
+        <w:t>Slide img</w:t>
+      </w:r>
+    </w:p>
+    <w:p>
+      <w:r>
+        <w:t>Arrow</w:t>
+      </w:r>
+    </w:p>
+    <w:p>
+      <w:r>
+        <w:t>Left</w:t>
+      </w:r>
+    </w:p>
+    <w:p>
+      <w:r>
+        <w:t>Right</w:t>
+      </w:r>
+    </w:p>
+    <w:p>
+      <w:r>
+        <w:t>Dots</w:t>
+      </w:r>
+    </w:p>
+    <w:p>
+      <w:r>
+        <w:t>Dot</w:t>
+      </w:r>
+    </w:p>
+    <w:p>
+      <w:r>
+        <w:t>Dot active</w:t>
       </w:r>
     </w:p>
     <w:p>
@@ -1904,12 +3089,63 @@
         <w:pStyle w:val="Heading4"/>
       </w:pPr>
       <w:r>
-        <w:t>Prys</w:t>
-      </w:r>
-    </w:p>
-    <w:p>
-      <w:r>
-        <w:t>Price</w:t>
+        <w:t xml:space="preserve">Mini galery </w:t>
+      </w:r>
+      <w:r>
+        <w:t>-</w:t>
+      </w:r>
+      <w:r>
+        <w:t xml:space="preserve"> </w:t>
+      </w:r>
+      <w:r>
+        <w:t>T</w:t>
+      </w:r>
+      <w:r>
+        <w:t>rop</w:t>
+      </w:r>
+      <w:r>
+        <w:t xml:space="preserve"> blad</w:t>
+      </w:r>
+    </w:p>
+    <w:p>
+      <w:r>
+        <w:t>Mini gallery</w:t>
+      </w:r>
+    </w:p>
+    <w:p>
+      <w:r>
+        <w:t>Mini slide</w:t>
+      </w:r>
+    </w:p>
+    <w:p>
+      <w:r>
+        <w:t>Mini slide img</w:t>
+      </w:r>
+    </w:p>
+    <w:p>
+      <w:r>
+        <w:t>Mini active</w:t>
+      </w:r>
+    </w:p>
+    <w:p>
+      <w:r>
+        <w:t>Mini gallery, mini arrow</w:t>
+      </w:r>
+    </w:p>
+    <w:p>
+      <w:r>
+        <w:t>Mini gallery, mini arrow hover</w:t>
+      </w:r>
+    </w:p>
+    <w:p>
+      <w:r>
+        <w:t>Mini gallery mini left</w:t>
+      </w:r>
+    </w:p>
+    <w:p>
+      <w:r>
+        <w:lastRenderedPageBreak/>
+        <w:t>Mini gallery mini right</w:t>
       </w:r>
     </w:p>
     <w:p>
@@ -1917,125 +3153,251 @@
         <w:pStyle w:val="Heading4"/>
       </w:pPr>
       <w:r>
-        <w:t>Lae voorraad waarsku</w:t>
-      </w:r>
-    </w:p>
-    <w:p>
-      <w:r>
-        <w:t>Low stock row</w:t>
-      </w:r>
-    </w:p>
-    <w:p>
-      <w:r>
-        <w:t>Low stock emphasis</w:t>
-      </w:r>
-    </w:p>
-    <w:p>
-      <w:r>
-        <w:t>Status low</w:t>
-      </w:r>
-    </w:p>
+        <w:t>Produkte gallery</w:t>
+      </w:r>
+      <w:r>
+        <w:t xml:space="preserve"> </w:t>
+      </w:r>
+      <w:r>
+        <w:t xml:space="preserve">- </w:t>
+      </w:r>
+      <w:r>
+        <w:t>P</w:t>
+      </w:r>
+      <w:r>
+        <w:t>rodukte blad</w:t>
+      </w:r>
+    </w:p>
+    <w:p/>
     <w:p>
       <w:pPr>
         <w:pStyle w:val="Heading4"/>
       </w:pPr>
       <w:r>
-        <w:t>Soekveld en invoeg</w:t>
-      </w:r>
-    </w:p>
-    <w:p>
-      <w:r>
-        <w:t>Controls</w:t>
-      </w:r>
-    </w:p>
-    <w:p>
-      <w:r>
-        <w:t>Input</w:t>
-      </w:r>
-    </w:p>
-    <w:p>
-      <w:r>
-        <w:t>Button add btn</w:t>
-      </w:r>
-    </w:p>
-    <w:p>
-      <w:r>
-        <w:t>Button add btn hover</w:t>
+        <w:t xml:space="preserve">Produkte </w:t>
+      </w:r>
+      <w:r>
+        <w:t>prente</w:t>
+      </w:r>
+      <w:r>
+        <w:t xml:space="preserve"> - Tuisblad</w:t>
+      </w:r>
+    </w:p>
+    <w:p>
+      <w:r>
+        <w:t>Produk prent</w:t>
+      </w:r>
+    </w:p>
+    <w:p>
+      <w:r>
+        <w:t>Produk prent img</w:t>
+      </w:r>
+    </w:p>
+    <w:p>
+      <w:r>
+        <w:t>Produk prent img hover img</w:t>
+      </w:r>
+    </w:p>
+    <w:p>
+      <w:pPr>
+        <w:pStyle w:val="Heading4"/>
+      </w:pPr>
+      <w:r>
+        <w:t>Prent Teksboks kombinasie</w:t>
+      </w:r>
+    </w:p>
+    <w:p>
+      <w:r>
+        <w:t>Prent</w:t>
+      </w:r>
+    </w:p>
+    <w:p>
+      <w:pPr>
+        <w:ind w:left="720"/>
+      </w:pPr>
+      <w:r>
+        <w:t>Prent boks</w:t>
+      </w:r>
+    </w:p>
+    <w:p>
+      <w:pPr>
+        <w:ind w:left="720"/>
+      </w:pPr>
+      <w:r>
+        <w:t>Prent boks img</w:t>
+      </w:r>
+    </w:p>
+    <w:p>
+      <w:r>
+        <w:t xml:space="preserve">Teks </w:t>
+      </w:r>
+    </w:p>
+    <w:p>
+      <w:pPr>
+        <w:ind w:firstLine="720"/>
+      </w:pPr>
+      <w:r>
+        <w:t>Teks boks</w:t>
+      </w:r>
+    </w:p>
+    <w:p>
+      <w:pPr>
+        <w:pStyle w:val="Heading4"/>
+      </w:pPr>
+      <w:r>
+        <w:t>Geskiedenis prent</w:t>
+      </w:r>
+    </w:p>
+    <w:p>
+      <w:r>
+        <w:t>Center prent</w:t>
       </w:r>
     </w:p>
     <w:p>
       <w:pPr>
         <w:pStyle w:val="Heading3"/>
       </w:pPr>
-      <w:bookmarkStart w:id="9" w:name="_Toc224731908"/>
-      <w:r>
-        <w:t>Gallerye</w:t>
-      </w:r>
-      <w:r>
-        <w:t xml:space="preserve"> en prente</w:t>
-      </w:r>
-      <w:bookmarkEnd w:id="9"/>
+      <w:bookmarkStart w:id="10" w:name="_Toc224731909"/>
+      <w:r>
+        <w:t>Kolpuntlyste</w:t>
+      </w:r>
+      <w:bookmarkEnd w:id="10"/>
     </w:p>
     <w:p>
       <w:pPr>
         <w:pStyle w:val="Heading4"/>
       </w:pPr>
       <w:r>
-        <w:t>Galery</w:t>
-      </w:r>
-      <w:r>
-        <w:t xml:space="preserve"> - Tuisblad</w:t>
-      </w:r>
-    </w:p>
-    <w:p>
-      <w:r>
-        <w:t>Gallery</w:t>
-      </w:r>
-    </w:p>
-    <w:p>
-      <w:r>
-        <w:t>Slide</w:t>
-      </w:r>
-    </w:p>
-    <w:p>
-      <w:r>
-        <w:t>Slide active</w:t>
-      </w:r>
-    </w:p>
-    <w:p>
-      <w:r>
-        <w:t>Slide img</w:t>
-      </w:r>
-    </w:p>
-    <w:p>
-      <w:r>
-        <w:t>Arrow</w:t>
-      </w:r>
-    </w:p>
-    <w:p>
-      <w:r>
-        <w:t>Left</w:t>
-      </w:r>
-    </w:p>
-    <w:p>
-      <w:r>
-        <w:t>Right</w:t>
-      </w:r>
-    </w:p>
-    <w:p>
-      <w:r>
-        <w:t>Dots</w:t>
-      </w:r>
-    </w:p>
-    <w:p>
+        <w:t>Genommer</w:t>
+      </w:r>
+    </w:p>
+    <w:p>
+      <w:r>
+        <w:t>Nommer-lys</w:t>
+      </w:r>
+    </w:p>
+    <w:p>
+      <w:r>
+        <w:t>Nommer lys h3</w:t>
+      </w:r>
+    </w:p>
+    <w:p>
+      <w:r>
+        <w:t>Nommer item</w:t>
+      </w:r>
+    </w:p>
+    <w:p>
+      <w:r>
+        <w:t>Nommer ikoon</w:t>
+      </w:r>
+    </w:p>
+    <w:p>
+      <w:pPr>
+        <w:pStyle w:val="Heading4"/>
+      </w:pPr>
+      <w:r>
+        <w:t>Regmerkie</w:t>
+      </w:r>
+    </w:p>
+    <w:p>
+      <w:r>
+        <w:t>Regmerkie lys</w:t>
+      </w:r>
+    </w:p>
+    <w:p>
+      <w:r>
+        <w:t>Regmerkie item</w:t>
+      </w:r>
+    </w:p>
+    <w:p>
+      <w:r>
+        <w:t>Regmerkie ikoon</w:t>
+      </w:r>
+    </w:p>
+    <w:p>
+      <w:pPr>
+        <w:pStyle w:val="Heading4"/>
+      </w:pPr>
+      <w:r>
+        <w:t>Rooster regmerkie</w:t>
+      </w:r>
+    </w:p>
+    <w:p>
+      <w:r>
+        <w:t>Rooster regmerkie lys</w:t>
+      </w:r>
+    </w:p>
+    <w:p>
+      <w:r>
+        <w:t>Rooster regmerkie item</w:t>
+      </w:r>
+    </w:p>
+    <w:p>
+      <w:r>
+        <w:t>Rooster regmerkie ikoon</w:t>
+      </w:r>
+    </w:p>
+    <w:p>
+      <w:pPr>
+        <w:pStyle w:val="Heading3"/>
+      </w:pPr>
+      <w:bookmarkStart w:id="11" w:name="_Toc224731910"/>
+      <w:r>
+        <w:t>Webvorms</w:t>
+      </w:r>
+      <w:bookmarkEnd w:id="11"/>
+    </w:p>
+    <w:p/>
+    <w:p>
+      <w:pPr>
+        <w:pStyle w:val="Heading3"/>
+      </w:pPr>
+      <w:bookmarkStart w:id="12" w:name="_Toc224731911"/>
+      <w:r>
+        <w:t>Ander</w:t>
+      </w:r>
+      <w:bookmarkEnd w:id="12"/>
+    </w:p>
+    <w:p>
+      <w:pPr>
+        <w:pStyle w:val="Heading4"/>
+      </w:pPr>
+      <w:r>
+        <w:t>Blokaanhaling</w:t>
+      </w:r>
+    </w:p>
+    <w:p>
+      <w:r>
+        <w:t>blockquote</w:t>
+      </w:r>
+    </w:p>
+    <w:p>
+      <w:pPr>
+        <w:pStyle w:val="Heading4"/>
+      </w:pPr>
       <w:r>
         <w:lastRenderedPageBreak/>
-        <w:t>Dot</w:t>
-      </w:r>
-    </w:p>
-    <w:p>
-      <w:r>
-        <w:t>Dot active</w:t>
+        <w:t>Horisontale stippel lyn</w:t>
+      </w:r>
+    </w:p>
+    <w:p>
+      <w:r>
+        <w:t>Hr afdeling titel</w:t>
+      </w:r>
+    </w:p>
+    <w:p>
+      <w:r>
+        <w:t>Hr afdeling titel hr</w:t>
+      </w:r>
+    </w:p>
+    <w:p>
+      <w:r>
+        <w:t>Afdeling titel blok</w:t>
+      </w:r>
+    </w:p>
+    <w:p>
+      <w:r>
+        <w:t>Afdeling titel blok p</w:t>
       </w:r>
     </w:p>
     <w:p>
@@ -2043,62 +3405,22 @@
         <w:pStyle w:val="Heading4"/>
       </w:pPr>
       <w:r>
-        <w:t xml:space="preserve">Mini galery </w:t>
-      </w:r>
-      <w:r>
-        <w:t>-</w:t>
-      </w:r>
-      <w:r>
-        <w:t xml:space="preserve"> </w:t>
-      </w:r>
-      <w:r>
-        <w:t>T</w:t>
-      </w:r>
-      <w:r>
-        <w:t>rop</w:t>
-      </w:r>
-      <w:r>
-        <w:t xml:space="preserve"> blad</w:t>
-      </w:r>
-    </w:p>
-    <w:p>
-      <w:r>
-        <w:t>Mini gallery</w:t>
-      </w:r>
-    </w:p>
-    <w:p>
-      <w:r>
-        <w:t>Mini slide</w:t>
-      </w:r>
-    </w:p>
-    <w:p>
-      <w:r>
-        <w:t>Mini slide img</w:t>
-      </w:r>
-    </w:p>
-    <w:p>
-      <w:r>
-        <w:t>Mini active</w:t>
-      </w:r>
-    </w:p>
-    <w:p>
-      <w:r>
-        <w:t>Mini gallery, mini arrow</w:t>
-      </w:r>
-    </w:p>
-    <w:p>
-      <w:r>
-        <w:t>Mini gallery, mini arrow hover</w:t>
-      </w:r>
-    </w:p>
-    <w:p>
-      <w:r>
-        <w:t>Mini gallery mini left</w:t>
-      </w:r>
-    </w:p>
-    <w:p>
-      <w:r>
-        <w:t>Mini gallery mini right</w:t>
+        <w:t>Logo blok</w:t>
+      </w:r>
+    </w:p>
+    <w:p>
+      <w:r>
+        <w:t>Logo blok</w:t>
+      </w:r>
+    </w:p>
+    <w:p>
+      <w:r>
+        <w:t>Logo sirkel</w:t>
+      </w:r>
+    </w:p>
+    <w:p>
+      <w:r>
+        <w:t>Logo blok p</w:t>
       </w:r>
     </w:p>
     <w:p>
@@ -2106,49 +3428,70 @@
         <w:pStyle w:val="Heading4"/>
       </w:pPr>
       <w:r>
-        <w:t>Produkte gallery</w:t>
-      </w:r>
-      <w:r>
-        <w:t xml:space="preserve"> </w:t>
-      </w:r>
-      <w:r>
-        <w:t xml:space="preserve">- </w:t>
-      </w:r>
-      <w:r>
-        <w:t>P</w:t>
-      </w:r>
-      <w:r>
-        <w:t>rodukte blad</w:t>
-      </w:r>
-    </w:p>
-    <w:p/>
+        <w:t>Voetskrif</w:t>
+      </w:r>
+    </w:p>
+    <w:p>
+      <w:r>
+        <w:t>Footer</w:t>
+      </w:r>
+    </w:p>
+    <w:p>
+      <w:r>
+        <w:t>Footer containder</w:t>
+      </w:r>
+    </w:p>
+    <w:p>
+      <w:r>
+        <w:t>Footer lings, Footer regs</w:t>
+      </w:r>
+    </w:p>
+    <w:p>
+      <w:r>
+        <w:t>Footer lings p, Footer regs p</w:t>
+      </w:r>
+    </w:p>
+    <w:p>
+      <w:r>
+        <w:t>Footer right p strong</w:t>
+      </w:r>
+    </w:p>
+    <w:p>
+      <w:r>
+        <w:t>Footer copyright</w:t>
+      </w:r>
+    </w:p>
     <w:p>
       <w:pPr>
         <w:pStyle w:val="Heading4"/>
       </w:pPr>
       <w:r>
-        <w:t xml:space="preserve">Produkte </w:t>
-      </w:r>
-      <w:r>
-        <w:t>prente</w:t>
-      </w:r>
-      <w:r>
-        <w:t xml:space="preserve"> - Tuisblad</w:t>
-      </w:r>
-    </w:p>
-    <w:p>
-      <w:r>
-        <w:t>Produk prent</w:t>
-      </w:r>
-    </w:p>
-    <w:p>
-      <w:r>
-        <w:t>Produk prent img</w:t>
-      </w:r>
-    </w:p>
-    <w:p>
-      <w:r>
-        <w:t>Produk prent img hover img</w:t>
+        <w:t>Opdeel</w:t>
+      </w:r>
+    </w:p>
+    <w:p>
+      <w:r>
+        <w:t>Split</w:t>
+      </w:r>
+    </w:p>
+    <w:p>
+      <w:r>
+        <w:t>Split nth child</w:t>
+      </w:r>
+    </w:p>
+    <w:p>
+      <w:r>
+        <w:t>Split show</w:t>
+      </w:r>
+    </w:p>
+    <w:p>
+      <w:r>
+        <w:t>Split img</w:t>
+      </w:r>
+    </w:p>
+    <w:p>
+      <w:r>
+        <w:t>Split teks, split img</w:t>
       </w:r>
     </w:p>
     <w:p>
@@ -2156,358 +3499,62 @@
         <w:pStyle w:val="Heading4"/>
       </w:pPr>
       <w:r>
-        <w:t>Prent Teksboks kombinasie</w:t>
-      </w:r>
-    </w:p>
-    <w:p>
-      <w:r>
-        <w:t>Prent</w:t>
-      </w:r>
-    </w:p>
-    <w:p>
-      <w:pPr>
-        <w:ind w:left="720"/>
-      </w:pPr>
-      <w:r>
-        <w:t>Prent boks</w:t>
-      </w:r>
-    </w:p>
-    <w:p>
-      <w:pPr>
-        <w:ind w:left="720"/>
-      </w:pPr>
-      <w:r>
-        <w:t>Prent boks img</w:t>
-      </w:r>
-    </w:p>
-    <w:p>
-      <w:r>
-        <w:t xml:space="preserve">Teks </w:t>
-      </w:r>
-    </w:p>
-    <w:p>
-      <w:pPr>
-        <w:ind w:firstLine="720"/>
-      </w:pPr>
-      <w:r>
-        <w:t>Teks boks</w:t>
-      </w:r>
-    </w:p>
-    <w:p>
-      <w:pPr>
-        <w:pStyle w:val="Heading4"/>
-      </w:pPr>
-      <w:r>
-        <w:t>Geskiedenis prent</w:t>
-      </w:r>
-    </w:p>
-    <w:p>
-      <w:r>
-        <w:t>Center prent</w:t>
-      </w:r>
-    </w:p>
-    <w:p>
-      <w:pPr>
-        <w:pStyle w:val="Heading3"/>
-      </w:pPr>
-      <w:bookmarkStart w:id="10" w:name="_Toc224731909"/>
-      <w:r>
-        <w:t>Kolpuntlyste</w:t>
-      </w:r>
-      <w:bookmarkEnd w:id="10"/>
-    </w:p>
-    <w:p>
-      <w:pPr>
-        <w:pStyle w:val="Heading4"/>
-      </w:pPr>
-      <w:r>
-        <w:t>Genommer</w:t>
-      </w:r>
-    </w:p>
-    <w:p>
-      <w:r>
-        <w:t>Nommer-lys</w:t>
-      </w:r>
-    </w:p>
-    <w:p>
-      <w:r>
-        <w:t>Nommer lys h3</w:t>
-      </w:r>
-    </w:p>
-    <w:p>
-      <w:r>
-        <w:t>Nommer item</w:t>
-      </w:r>
-    </w:p>
-    <w:p>
-      <w:r>
-        <w:t>Nommer ikoon</w:t>
-      </w:r>
-    </w:p>
-    <w:p>
-      <w:pPr>
-        <w:pStyle w:val="Heading4"/>
-      </w:pPr>
-      <w:r>
-        <w:t>Regmerkie</w:t>
-      </w:r>
-    </w:p>
-    <w:p>
-      <w:r>
-        <w:t>Regmerkie lys</w:t>
-      </w:r>
-    </w:p>
-    <w:p>
-      <w:r>
-        <w:t>Regmerkie item</w:t>
+        <w:t>Top verkope</w:t>
+      </w:r>
+    </w:p>
+    <w:p>
+      <w:r>
+        <w:t>Top verkope preview</w:t>
+      </w:r>
+    </w:p>
+    <w:p>
+      <w:r>
+        <w:t>Top products cards</w:t>
+      </w:r>
+    </w:p>
+    <w:p>
+      <w:r>
+        <w:t>Top products card</w:t>
+      </w:r>
+    </w:p>
+    <w:p>
+      <w:r>
+        <w:t>Top product card img</w:t>
+      </w:r>
+    </w:p>
+    <w:p>
+      <w:r>
+        <w:t>Top product card center</w:t>
+      </w:r>
+    </w:p>
+    <w:p>
+      <w:r>
+        <w:t>Top product card center img</w:t>
+      </w:r>
+    </w:p>
+    <w:p>
+      <w:r>
+        <w:t>Top product card hover</w:t>
+      </w:r>
+    </w:p>
+    <w:p>
+      <w:r>
+        <w:t>Top product card center hover</w:t>
+      </w:r>
+    </w:p>
+    <w:p>
+      <w:r>
+        <w:t>Top product card body</w:t>
+      </w:r>
+    </w:p>
+    <w:p>
+      <w:r>
+        <w:t>Top product rank</w:t>
       </w:r>
     </w:p>
     <w:p>
       <w:r>
         <w:lastRenderedPageBreak/>
-        <w:t>Regmerkie ikoon</w:t>
-      </w:r>
-    </w:p>
-    <w:p>
-      <w:pPr>
-        <w:pStyle w:val="Heading4"/>
-      </w:pPr>
-      <w:r>
-        <w:t>Rooster regmerkie</w:t>
-      </w:r>
-    </w:p>
-    <w:p>
-      <w:r>
-        <w:t>Rooster regmerkie lys</w:t>
-      </w:r>
-    </w:p>
-    <w:p>
-      <w:r>
-        <w:t>Rooster regmerkie item</w:t>
-      </w:r>
-    </w:p>
-    <w:p>
-      <w:r>
-        <w:t>Rooster regmerkie ikoon</w:t>
-      </w:r>
-    </w:p>
-    <w:p>
-      <w:pPr>
-        <w:pStyle w:val="Heading3"/>
-      </w:pPr>
-      <w:bookmarkStart w:id="11" w:name="_Toc224731910"/>
-      <w:r>
-        <w:t>Webvorms</w:t>
-      </w:r>
-      <w:bookmarkEnd w:id="11"/>
-    </w:p>
-    <w:p/>
-    <w:p>
-      <w:pPr>
-        <w:pStyle w:val="Heading3"/>
-      </w:pPr>
-      <w:bookmarkStart w:id="12" w:name="_Toc224731911"/>
-      <w:r>
-        <w:t>Ander</w:t>
-      </w:r>
-      <w:bookmarkEnd w:id="12"/>
-    </w:p>
-    <w:p>
-      <w:pPr>
-        <w:pStyle w:val="Heading4"/>
-      </w:pPr>
-      <w:r>
-        <w:t>Blokaanhaling</w:t>
-      </w:r>
-    </w:p>
-    <w:p>
-      <w:r>
-        <w:t>blockquote</w:t>
-      </w:r>
-    </w:p>
-    <w:p>
-      <w:pPr>
-        <w:pStyle w:val="Heading4"/>
-      </w:pPr>
-      <w:r>
-        <w:t>Horisontale stippel lyn</w:t>
-      </w:r>
-    </w:p>
-    <w:p>
-      <w:r>
-        <w:t>Hr afdeling titel</w:t>
-      </w:r>
-    </w:p>
-    <w:p>
-      <w:r>
-        <w:t>Hr afdeling titel hr</w:t>
-      </w:r>
-    </w:p>
-    <w:p>
-      <w:r>
-        <w:t>Afdeling titel blok</w:t>
-      </w:r>
-    </w:p>
-    <w:p>
-      <w:r>
-        <w:t>Afdeling titel blok p</w:t>
-      </w:r>
-    </w:p>
-    <w:p>
-      <w:pPr>
-        <w:pStyle w:val="Heading4"/>
-      </w:pPr>
-      <w:r>
-        <w:t>Logo blok</w:t>
-      </w:r>
-    </w:p>
-    <w:p>
-      <w:r>
-        <w:t>Logo blok</w:t>
-      </w:r>
-    </w:p>
-    <w:p>
-      <w:r>
-        <w:t>Logo sirkel</w:t>
-      </w:r>
-    </w:p>
-    <w:p>
-      <w:r>
-        <w:t>Logo blok p</w:t>
-      </w:r>
-    </w:p>
-    <w:p>
-      <w:pPr>
-        <w:pStyle w:val="Heading4"/>
-      </w:pPr>
-      <w:r>
-        <w:t>Voetskrif</w:t>
-      </w:r>
-    </w:p>
-    <w:p>
-      <w:r>
-        <w:t>Footer</w:t>
-      </w:r>
-    </w:p>
-    <w:p>
-      <w:r>
-        <w:t>Footer containder</w:t>
-      </w:r>
-    </w:p>
-    <w:p>
-      <w:r>
-        <w:t>Footer lings, Footer regs</w:t>
-      </w:r>
-    </w:p>
-    <w:p>
-      <w:r>
-        <w:t>Footer lings p, Footer regs p</w:t>
-      </w:r>
-    </w:p>
-    <w:p>
-      <w:r>
-        <w:t>Footer right p strong</w:t>
-      </w:r>
-    </w:p>
-    <w:p>
-      <w:r>
-        <w:t>Footer copyright</w:t>
-      </w:r>
-    </w:p>
-    <w:p>
-      <w:pPr>
-        <w:pStyle w:val="Heading4"/>
-      </w:pPr>
-      <w:r>
-        <w:t>Opdeel</w:t>
-      </w:r>
-    </w:p>
-    <w:p>
-      <w:r>
-        <w:t>Split</w:t>
-      </w:r>
-    </w:p>
-    <w:p>
-      <w:r>
-        <w:t>Split nth child</w:t>
-      </w:r>
-    </w:p>
-    <w:p>
-      <w:r>
-        <w:t>Split show</w:t>
-      </w:r>
-    </w:p>
-    <w:p>
-      <w:r>
-        <w:t>Split img</w:t>
-      </w:r>
-    </w:p>
-    <w:p>
-      <w:r>
-        <w:t>Split teks, split img</w:t>
-      </w:r>
-    </w:p>
-    <w:p>
-      <w:pPr>
-        <w:pStyle w:val="Heading4"/>
-      </w:pPr>
-      <w:r>
-        <w:t>Top verkope</w:t>
-      </w:r>
-    </w:p>
-    <w:p>
-      <w:r>
-        <w:t>Top verkope preview</w:t>
-      </w:r>
-    </w:p>
-    <w:p>
-      <w:r>
-        <w:lastRenderedPageBreak/>
-        <w:t>Top products cards</w:t>
-      </w:r>
-    </w:p>
-    <w:p>
-      <w:r>
-        <w:t>Top products card</w:t>
-      </w:r>
-    </w:p>
-    <w:p>
-      <w:r>
-        <w:t>Top product card img</w:t>
-      </w:r>
-    </w:p>
-    <w:p>
-      <w:r>
-        <w:t>Top product card center</w:t>
-      </w:r>
-    </w:p>
-    <w:p>
-      <w:r>
-        <w:t>Top product card center img</w:t>
-      </w:r>
-    </w:p>
-    <w:p>
-      <w:r>
-        <w:t>Top product card hover</w:t>
-      </w:r>
-    </w:p>
-    <w:p>
-      <w:r>
-        <w:t>Top product card center hover</w:t>
-      </w:r>
-    </w:p>
-    <w:p>
-      <w:r>
-        <w:t>Top product card body</w:t>
-      </w:r>
-    </w:p>
-    <w:p>
-      <w:r>
-        <w:t>Top product rank</w:t>
-      </w:r>
-    </w:p>
-    <w:p>
-      <w:r>
         <w:t>Top product name</w:t>
       </w:r>
     </w:p>
@@ -2944,6 +3991,119 @@
     </w:lvl>
   </w:abstractNum>
   <w:abstractNum w:abstractNumId="3" w15:restartNumberingAfterBreak="0">
+    <w:nsid w:val="07643C94"/>
+    <w:multiLevelType w:val="hybridMultilevel"/>
+    <w:tmpl w:val="5A969CF8"/>
+    <w:lvl w:ilvl="0" w:tplc="1C090001">
+      <w:start w:val="1"/>
+      <w:numFmt w:val="bullet"/>
+      <w:lvlText w:val=""/>
+      <w:lvlJc w:val="left"/>
+      <w:pPr>
+        <w:ind w:left="360" w:hanging="360"/>
+      </w:pPr>
+      <w:rPr>
+        <w:rFonts w:ascii="Symbol" w:hAnsi="Symbol" w:hint="default"/>
+      </w:rPr>
+    </w:lvl>
+    <w:lvl w:ilvl="1" w:tplc="1C090003" w:tentative="1">
+      <w:start w:val="1"/>
+      <w:numFmt w:val="bullet"/>
+      <w:lvlText w:val="o"/>
+      <w:lvlJc w:val="left"/>
+      <w:pPr>
+        <w:ind w:left="1080" w:hanging="360"/>
+      </w:pPr>
+      <w:rPr>
+        <w:rFonts w:ascii="Courier New" w:hAnsi="Courier New" w:cs="Courier New" w:hint="default"/>
+      </w:rPr>
+    </w:lvl>
+    <w:lvl w:ilvl="2" w:tplc="1C090005" w:tentative="1">
+      <w:start w:val="1"/>
+      <w:numFmt w:val="bullet"/>
+      <w:lvlText w:val=""/>
+      <w:lvlJc w:val="left"/>
+      <w:pPr>
+        <w:ind w:left="1800" w:hanging="360"/>
+      </w:pPr>
+      <w:rPr>
+        <w:rFonts w:ascii="Wingdings" w:hAnsi="Wingdings" w:hint="default"/>
+      </w:rPr>
+    </w:lvl>
+    <w:lvl w:ilvl="3" w:tplc="1C090001" w:tentative="1">
+      <w:start w:val="1"/>
+      <w:numFmt w:val="bullet"/>
+      <w:lvlText w:val=""/>
+      <w:lvlJc w:val="left"/>
+      <w:pPr>
+        <w:ind w:left="2520" w:hanging="360"/>
+      </w:pPr>
+      <w:rPr>
+        <w:rFonts w:ascii="Symbol" w:hAnsi="Symbol" w:hint="default"/>
+      </w:rPr>
+    </w:lvl>
+    <w:lvl w:ilvl="4" w:tplc="1C090003" w:tentative="1">
+      <w:start w:val="1"/>
+      <w:numFmt w:val="bullet"/>
+      <w:lvlText w:val="o"/>
+      <w:lvlJc w:val="left"/>
+      <w:pPr>
+        <w:ind w:left="3240" w:hanging="360"/>
+      </w:pPr>
+      <w:rPr>
+        <w:rFonts w:ascii="Courier New" w:hAnsi="Courier New" w:cs="Courier New" w:hint="default"/>
+      </w:rPr>
+    </w:lvl>
+    <w:lvl w:ilvl="5" w:tplc="1C090005" w:tentative="1">
+      <w:start w:val="1"/>
+      <w:numFmt w:val="bullet"/>
+      <w:lvlText w:val=""/>
+      <w:lvlJc w:val="left"/>
+      <w:pPr>
+        <w:ind w:left="3960" w:hanging="360"/>
+      </w:pPr>
+      <w:rPr>
+        <w:rFonts w:ascii="Wingdings" w:hAnsi="Wingdings" w:hint="default"/>
+      </w:rPr>
+    </w:lvl>
+    <w:lvl w:ilvl="6" w:tplc="1C090001" w:tentative="1">
+      <w:start w:val="1"/>
+      <w:numFmt w:val="bullet"/>
+      <w:lvlText w:val=""/>
+      <w:lvlJc w:val="left"/>
+      <w:pPr>
+        <w:ind w:left="4680" w:hanging="360"/>
+      </w:pPr>
+      <w:rPr>
+        <w:rFonts w:ascii="Symbol" w:hAnsi="Symbol" w:hint="default"/>
+      </w:rPr>
+    </w:lvl>
+    <w:lvl w:ilvl="7" w:tplc="1C090003" w:tentative="1">
+      <w:start w:val="1"/>
+      <w:numFmt w:val="bullet"/>
+      <w:lvlText w:val="o"/>
+      <w:lvlJc w:val="left"/>
+      <w:pPr>
+        <w:ind w:left="5400" w:hanging="360"/>
+      </w:pPr>
+      <w:rPr>
+        <w:rFonts w:ascii="Courier New" w:hAnsi="Courier New" w:cs="Courier New" w:hint="default"/>
+      </w:rPr>
+    </w:lvl>
+    <w:lvl w:ilvl="8" w:tplc="1C090005" w:tentative="1">
+      <w:start w:val="1"/>
+      <w:numFmt w:val="bullet"/>
+      <w:lvlText w:val=""/>
+      <w:lvlJc w:val="left"/>
+      <w:pPr>
+        <w:ind w:left="6120" w:hanging="360"/>
+      </w:pPr>
+      <w:rPr>
+        <w:rFonts w:ascii="Wingdings" w:hAnsi="Wingdings" w:hint="default"/>
+      </w:rPr>
+    </w:lvl>
+  </w:abstractNum>
+  <w:abstractNum w:abstractNumId="4" w15:restartNumberingAfterBreak="0">
     <w:nsid w:val="0A0B6FC0"/>
     <w:multiLevelType w:val="hybridMultilevel"/>
     <w:tmpl w:val="DBF86CA2"/>
@@ -3029,7 +4189,7 @@
       </w:pPr>
     </w:lvl>
   </w:abstractNum>
-  <w:abstractNum w:abstractNumId="4" w15:restartNumberingAfterBreak="0">
+  <w:abstractNum w:abstractNumId="5" w15:restartNumberingAfterBreak="0">
     <w:nsid w:val="1673695B"/>
     <w:multiLevelType w:val="hybridMultilevel"/>
     <w:tmpl w:val="E78A3430"/>
@@ -3115,7 +4275,7 @@
       </w:pPr>
     </w:lvl>
   </w:abstractNum>
-  <w:abstractNum w:abstractNumId="5" w15:restartNumberingAfterBreak="0">
+  <w:abstractNum w:abstractNumId="6" w15:restartNumberingAfterBreak="0">
     <w:nsid w:val="1B251680"/>
     <w:multiLevelType w:val="multilevel"/>
     <w:tmpl w:val="3DA67334"/>
@@ -3228,7 +4388,7 @@
       </w:rPr>
     </w:lvl>
   </w:abstractNum>
-  <w:abstractNum w:abstractNumId="6" w15:restartNumberingAfterBreak="0">
+  <w:abstractNum w:abstractNumId="7" w15:restartNumberingAfterBreak="0">
     <w:nsid w:val="1C19292C"/>
     <w:multiLevelType w:val="hybridMultilevel"/>
     <w:tmpl w:val="7B8888A8"/>
@@ -3314,7 +4474,7 @@
       </w:pPr>
     </w:lvl>
   </w:abstractNum>
-  <w:abstractNum w:abstractNumId="7" w15:restartNumberingAfterBreak="0">
+  <w:abstractNum w:abstractNumId="8" w15:restartNumberingAfterBreak="0">
     <w:nsid w:val="1C3011F9"/>
     <w:multiLevelType w:val="hybridMultilevel"/>
     <w:tmpl w:val="67F0E3C2"/>
@@ -3400,7 +4560,7 @@
       </w:pPr>
     </w:lvl>
   </w:abstractNum>
-  <w:abstractNum w:abstractNumId="8" w15:restartNumberingAfterBreak="0">
+  <w:abstractNum w:abstractNumId="9" w15:restartNumberingAfterBreak="0">
     <w:nsid w:val="22A43600"/>
     <w:multiLevelType w:val="hybridMultilevel"/>
     <w:tmpl w:val="A7C81A8E"/>
@@ -3486,7 +4646,7 @@
       </w:pPr>
     </w:lvl>
   </w:abstractNum>
-  <w:abstractNum w:abstractNumId="9" w15:restartNumberingAfterBreak="0">
+  <w:abstractNum w:abstractNumId="10" w15:restartNumberingAfterBreak="0">
     <w:nsid w:val="236E6936"/>
     <w:multiLevelType w:val="hybridMultilevel"/>
     <w:tmpl w:val="2544E968"/>
@@ -3572,7 +4732,7 @@
       </w:pPr>
     </w:lvl>
   </w:abstractNum>
-  <w:abstractNum w:abstractNumId="10" w15:restartNumberingAfterBreak="0">
+  <w:abstractNum w:abstractNumId="11" w15:restartNumberingAfterBreak="0">
     <w:nsid w:val="23A7638E"/>
     <w:multiLevelType w:val="hybridMultilevel"/>
     <w:tmpl w:val="DBF86CA2"/>
@@ -3658,7 +4818,7 @@
       </w:pPr>
     </w:lvl>
   </w:abstractNum>
-  <w:abstractNum w:abstractNumId="11" w15:restartNumberingAfterBreak="0">
+  <w:abstractNum w:abstractNumId="12" w15:restartNumberingAfterBreak="0">
     <w:nsid w:val="250D2637"/>
     <w:multiLevelType w:val="multilevel"/>
     <w:tmpl w:val="3DA67334"/>
@@ -3771,7 +4931,7 @@
       </w:rPr>
     </w:lvl>
   </w:abstractNum>
-  <w:abstractNum w:abstractNumId="12" w15:restartNumberingAfterBreak="0">
+  <w:abstractNum w:abstractNumId="13" w15:restartNumberingAfterBreak="0">
     <w:nsid w:val="27BE5357"/>
     <w:multiLevelType w:val="hybridMultilevel"/>
     <w:tmpl w:val="D742B84E"/>
@@ -3857,7 +5017,7 @@
       </w:pPr>
     </w:lvl>
   </w:abstractNum>
-  <w:abstractNum w:abstractNumId="13" w15:restartNumberingAfterBreak="0">
+  <w:abstractNum w:abstractNumId="14" w15:restartNumberingAfterBreak="0">
     <w:nsid w:val="2AAC448A"/>
     <w:multiLevelType w:val="hybridMultilevel"/>
     <w:tmpl w:val="498E2126"/>
@@ -3943,7 +5103,7 @@
       </w:pPr>
     </w:lvl>
   </w:abstractNum>
-  <w:abstractNum w:abstractNumId="14" w15:restartNumberingAfterBreak="0">
+  <w:abstractNum w:abstractNumId="15" w15:restartNumberingAfterBreak="0">
     <w:nsid w:val="2BD554B9"/>
     <w:multiLevelType w:val="hybridMultilevel"/>
     <w:tmpl w:val="EF9E086E"/>
@@ -4029,7 +5189,7 @@
       </w:pPr>
     </w:lvl>
   </w:abstractNum>
-  <w:abstractNum w:abstractNumId="15" w15:restartNumberingAfterBreak="0">
+  <w:abstractNum w:abstractNumId="16" w15:restartNumberingAfterBreak="0">
     <w:nsid w:val="344C150D"/>
     <w:multiLevelType w:val="hybridMultilevel"/>
     <w:tmpl w:val="89B2E39A"/>
@@ -4142,7 +5302,7 @@
       </w:rPr>
     </w:lvl>
   </w:abstractNum>
-  <w:abstractNum w:abstractNumId="16" w15:restartNumberingAfterBreak="0">
+  <w:abstractNum w:abstractNumId="17" w15:restartNumberingAfterBreak="0">
     <w:nsid w:val="38C05D67"/>
     <w:multiLevelType w:val="hybridMultilevel"/>
     <w:tmpl w:val="E64453B4"/>
@@ -4228,7 +5388,120 @@
       </w:pPr>
     </w:lvl>
   </w:abstractNum>
-  <w:abstractNum w:abstractNumId="17" w15:restartNumberingAfterBreak="0">
+  <w:abstractNum w:abstractNumId="18" w15:restartNumberingAfterBreak="0">
+    <w:nsid w:val="3A1F7F66"/>
+    <w:multiLevelType w:val="hybridMultilevel"/>
+    <w:tmpl w:val="A25663F0"/>
+    <w:lvl w:ilvl="0" w:tplc="1C090001">
+      <w:start w:val="1"/>
+      <w:numFmt w:val="bullet"/>
+      <w:lvlText w:val=""/>
+      <w:lvlJc w:val="left"/>
+      <w:pPr>
+        <w:ind w:left="360" w:hanging="360"/>
+      </w:pPr>
+      <w:rPr>
+        <w:rFonts w:ascii="Symbol" w:hAnsi="Symbol" w:hint="default"/>
+      </w:rPr>
+    </w:lvl>
+    <w:lvl w:ilvl="1" w:tplc="1C090003" w:tentative="1">
+      <w:start w:val="1"/>
+      <w:numFmt w:val="bullet"/>
+      <w:lvlText w:val="o"/>
+      <w:lvlJc w:val="left"/>
+      <w:pPr>
+        <w:ind w:left="1080" w:hanging="360"/>
+      </w:pPr>
+      <w:rPr>
+        <w:rFonts w:ascii="Courier New" w:hAnsi="Courier New" w:cs="Courier New" w:hint="default"/>
+      </w:rPr>
+    </w:lvl>
+    <w:lvl w:ilvl="2" w:tplc="1C090005" w:tentative="1">
+      <w:start w:val="1"/>
+      <w:numFmt w:val="bullet"/>
+      <w:lvlText w:val=""/>
+      <w:lvlJc w:val="left"/>
+      <w:pPr>
+        <w:ind w:left="1800" w:hanging="360"/>
+      </w:pPr>
+      <w:rPr>
+        <w:rFonts w:ascii="Wingdings" w:hAnsi="Wingdings" w:hint="default"/>
+      </w:rPr>
+    </w:lvl>
+    <w:lvl w:ilvl="3" w:tplc="1C090001" w:tentative="1">
+      <w:start w:val="1"/>
+      <w:numFmt w:val="bullet"/>
+      <w:lvlText w:val=""/>
+      <w:lvlJc w:val="left"/>
+      <w:pPr>
+        <w:ind w:left="2520" w:hanging="360"/>
+      </w:pPr>
+      <w:rPr>
+        <w:rFonts w:ascii="Symbol" w:hAnsi="Symbol" w:hint="default"/>
+      </w:rPr>
+    </w:lvl>
+    <w:lvl w:ilvl="4" w:tplc="1C090003" w:tentative="1">
+      <w:start w:val="1"/>
+      <w:numFmt w:val="bullet"/>
+      <w:lvlText w:val="o"/>
+      <w:lvlJc w:val="left"/>
+      <w:pPr>
+        <w:ind w:left="3240" w:hanging="360"/>
+      </w:pPr>
+      <w:rPr>
+        <w:rFonts w:ascii="Courier New" w:hAnsi="Courier New" w:cs="Courier New" w:hint="default"/>
+      </w:rPr>
+    </w:lvl>
+    <w:lvl w:ilvl="5" w:tplc="1C090005" w:tentative="1">
+      <w:start w:val="1"/>
+      <w:numFmt w:val="bullet"/>
+      <w:lvlText w:val=""/>
+      <w:lvlJc w:val="left"/>
+      <w:pPr>
+        <w:ind w:left="3960" w:hanging="360"/>
+      </w:pPr>
+      <w:rPr>
+        <w:rFonts w:ascii="Wingdings" w:hAnsi="Wingdings" w:hint="default"/>
+      </w:rPr>
+    </w:lvl>
+    <w:lvl w:ilvl="6" w:tplc="1C090001" w:tentative="1">
+      <w:start w:val="1"/>
+      <w:numFmt w:val="bullet"/>
+      <w:lvlText w:val=""/>
+      <w:lvlJc w:val="left"/>
+      <w:pPr>
+        <w:ind w:left="4680" w:hanging="360"/>
+      </w:pPr>
+      <w:rPr>
+        <w:rFonts w:ascii="Symbol" w:hAnsi="Symbol" w:hint="default"/>
+      </w:rPr>
+    </w:lvl>
+    <w:lvl w:ilvl="7" w:tplc="1C090003" w:tentative="1">
+      <w:start w:val="1"/>
+      <w:numFmt w:val="bullet"/>
+      <w:lvlText w:val="o"/>
+      <w:lvlJc w:val="left"/>
+      <w:pPr>
+        <w:ind w:left="5400" w:hanging="360"/>
+      </w:pPr>
+      <w:rPr>
+        <w:rFonts w:ascii="Courier New" w:hAnsi="Courier New" w:cs="Courier New" w:hint="default"/>
+      </w:rPr>
+    </w:lvl>
+    <w:lvl w:ilvl="8" w:tplc="1C090005" w:tentative="1">
+      <w:start w:val="1"/>
+      <w:numFmt w:val="bullet"/>
+      <w:lvlText w:val=""/>
+      <w:lvlJc w:val="left"/>
+      <w:pPr>
+        <w:ind w:left="6120" w:hanging="360"/>
+      </w:pPr>
+      <w:rPr>
+        <w:rFonts w:ascii="Wingdings" w:hAnsi="Wingdings" w:hint="default"/>
+      </w:rPr>
+    </w:lvl>
+  </w:abstractNum>
+  <w:abstractNum w:abstractNumId="19" w15:restartNumberingAfterBreak="0">
     <w:nsid w:val="3B15529C"/>
     <w:multiLevelType w:val="hybridMultilevel"/>
     <w:tmpl w:val="E78A3430"/>
@@ -4314,7 +5587,7 @@
       </w:pPr>
     </w:lvl>
   </w:abstractNum>
-  <w:abstractNum w:abstractNumId="18" w15:restartNumberingAfterBreak="0">
+  <w:abstractNum w:abstractNumId="20" w15:restartNumberingAfterBreak="0">
     <w:nsid w:val="3C332BD1"/>
     <w:multiLevelType w:val="multilevel"/>
     <w:tmpl w:val="1C09001F"/>
@@ -4400,7 +5673,7 @@
       </w:pPr>
     </w:lvl>
   </w:abstractNum>
-  <w:abstractNum w:abstractNumId="19" w15:restartNumberingAfterBreak="0">
+  <w:abstractNum w:abstractNumId="21" w15:restartNumberingAfterBreak="0">
     <w:nsid w:val="3D5A69CC"/>
     <w:multiLevelType w:val="hybridMultilevel"/>
     <w:tmpl w:val="29A29BCE"/>
@@ -4486,7 +5759,7 @@
       </w:pPr>
     </w:lvl>
   </w:abstractNum>
-  <w:abstractNum w:abstractNumId="20" w15:restartNumberingAfterBreak="0">
+  <w:abstractNum w:abstractNumId="22" w15:restartNumberingAfterBreak="0">
     <w:nsid w:val="3D691AE2"/>
     <w:multiLevelType w:val="multilevel"/>
     <w:tmpl w:val="3DA67334"/>
@@ -4599,7 +5872,7 @@
       </w:rPr>
     </w:lvl>
   </w:abstractNum>
-  <w:abstractNum w:abstractNumId="21" w15:restartNumberingAfterBreak="0">
+  <w:abstractNum w:abstractNumId="23" w15:restartNumberingAfterBreak="0">
     <w:nsid w:val="3E550233"/>
     <w:multiLevelType w:val="hybridMultilevel"/>
     <w:tmpl w:val="0F022560"/>
@@ -4685,7 +5958,7 @@
       </w:pPr>
     </w:lvl>
   </w:abstractNum>
-  <w:abstractNum w:abstractNumId="22" w15:restartNumberingAfterBreak="0">
+  <w:abstractNum w:abstractNumId="24" w15:restartNumberingAfterBreak="0">
     <w:nsid w:val="3FF60F04"/>
     <w:multiLevelType w:val="hybridMultilevel"/>
     <w:tmpl w:val="6D909AFA"/>
@@ -4798,7 +6071,7 @@
       </w:rPr>
     </w:lvl>
   </w:abstractNum>
-  <w:abstractNum w:abstractNumId="23" w15:restartNumberingAfterBreak="0">
+  <w:abstractNum w:abstractNumId="25" w15:restartNumberingAfterBreak="0">
     <w:nsid w:val="561F2B92"/>
     <w:multiLevelType w:val="hybridMultilevel"/>
     <w:tmpl w:val="DBF86CA2"/>
@@ -4884,7 +6157,7 @@
       </w:pPr>
     </w:lvl>
   </w:abstractNum>
-  <w:abstractNum w:abstractNumId="24" w15:restartNumberingAfterBreak="0">
+  <w:abstractNum w:abstractNumId="26" w15:restartNumberingAfterBreak="0">
     <w:nsid w:val="563F756E"/>
     <w:multiLevelType w:val="multilevel"/>
     <w:tmpl w:val="3DA67334"/>
@@ -4997,7 +6270,7 @@
       </w:rPr>
     </w:lvl>
   </w:abstractNum>
-  <w:abstractNum w:abstractNumId="25" w15:restartNumberingAfterBreak="0">
+  <w:abstractNum w:abstractNumId="27" w15:restartNumberingAfterBreak="0">
     <w:nsid w:val="5708066F"/>
     <w:multiLevelType w:val="hybridMultilevel"/>
     <w:tmpl w:val="9072D53A"/>
@@ -5086,7 +6359,7 @@
       </w:pPr>
     </w:lvl>
   </w:abstractNum>
-  <w:abstractNum w:abstractNumId="26" w15:restartNumberingAfterBreak="0">
+  <w:abstractNum w:abstractNumId="28" w15:restartNumberingAfterBreak="0">
     <w:nsid w:val="57080D91"/>
     <w:multiLevelType w:val="hybridMultilevel"/>
     <w:tmpl w:val="31EE03CC"/>
@@ -5172,7 +6445,7 @@
       </w:pPr>
     </w:lvl>
   </w:abstractNum>
-  <w:abstractNum w:abstractNumId="27" w15:restartNumberingAfterBreak="0">
+  <w:abstractNum w:abstractNumId="29" w15:restartNumberingAfterBreak="0">
     <w:nsid w:val="5D0F47EA"/>
     <w:multiLevelType w:val="hybridMultilevel"/>
     <w:tmpl w:val="27122EBE"/>
@@ -5258,7 +6531,120 @@
       </w:pPr>
     </w:lvl>
   </w:abstractNum>
-  <w:abstractNum w:abstractNumId="28" w15:restartNumberingAfterBreak="0">
+  <w:abstractNum w:abstractNumId="30" w15:restartNumberingAfterBreak="0">
+    <w:nsid w:val="65E42D44"/>
+    <w:multiLevelType w:val="hybridMultilevel"/>
+    <w:tmpl w:val="770C6816"/>
+    <w:lvl w:ilvl="0" w:tplc="1C090001">
+      <w:start w:val="1"/>
+      <w:numFmt w:val="bullet"/>
+      <w:lvlText w:val=""/>
+      <w:lvlJc w:val="left"/>
+      <w:pPr>
+        <w:ind w:left="720" w:hanging="360"/>
+      </w:pPr>
+      <w:rPr>
+        <w:rFonts w:ascii="Symbol" w:hAnsi="Symbol" w:hint="default"/>
+      </w:rPr>
+    </w:lvl>
+    <w:lvl w:ilvl="1" w:tplc="1C090003" w:tentative="1">
+      <w:start w:val="1"/>
+      <w:numFmt w:val="bullet"/>
+      <w:lvlText w:val="o"/>
+      <w:lvlJc w:val="left"/>
+      <w:pPr>
+        <w:ind w:left="1440" w:hanging="360"/>
+      </w:pPr>
+      <w:rPr>
+        <w:rFonts w:ascii="Courier New" w:hAnsi="Courier New" w:cs="Courier New" w:hint="default"/>
+      </w:rPr>
+    </w:lvl>
+    <w:lvl w:ilvl="2" w:tplc="1C090005" w:tentative="1">
+      <w:start w:val="1"/>
+      <w:numFmt w:val="bullet"/>
+      <w:lvlText w:val=""/>
+      <w:lvlJc w:val="left"/>
+      <w:pPr>
+        <w:ind w:left="2160" w:hanging="360"/>
+      </w:pPr>
+      <w:rPr>
+        <w:rFonts w:ascii="Wingdings" w:hAnsi="Wingdings" w:hint="default"/>
+      </w:rPr>
+    </w:lvl>
+    <w:lvl w:ilvl="3" w:tplc="1C090001" w:tentative="1">
+      <w:start w:val="1"/>
+      <w:numFmt w:val="bullet"/>
+      <w:lvlText w:val=""/>
+      <w:lvlJc w:val="left"/>
+      <w:pPr>
+        <w:ind w:left="2880" w:hanging="360"/>
+      </w:pPr>
+      <w:rPr>
+        <w:rFonts w:ascii="Symbol" w:hAnsi="Symbol" w:hint="default"/>
+      </w:rPr>
+    </w:lvl>
+    <w:lvl w:ilvl="4" w:tplc="1C090003" w:tentative="1">
+      <w:start w:val="1"/>
+      <w:numFmt w:val="bullet"/>
+      <w:lvlText w:val="o"/>
+      <w:lvlJc w:val="left"/>
+      <w:pPr>
+        <w:ind w:left="3600" w:hanging="360"/>
+      </w:pPr>
+      <w:rPr>
+        <w:rFonts w:ascii="Courier New" w:hAnsi="Courier New" w:cs="Courier New" w:hint="default"/>
+      </w:rPr>
+    </w:lvl>
+    <w:lvl w:ilvl="5" w:tplc="1C090005" w:tentative="1">
+      <w:start w:val="1"/>
+      <w:numFmt w:val="bullet"/>
+      <w:lvlText w:val=""/>
+      <w:lvlJc w:val="left"/>
+      <w:pPr>
+        <w:ind w:left="4320" w:hanging="360"/>
+      </w:pPr>
+      <w:rPr>
+        <w:rFonts w:ascii="Wingdings" w:hAnsi="Wingdings" w:hint="default"/>
+      </w:rPr>
+    </w:lvl>
+    <w:lvl w:ilvl="6" w:tplc="1C090001" w:tentative="1">
+      <w:start w:val="1"/>
+      <w:numFmt w:val="bullet"/>
+      <w:lvlText w:val=""/>
+      <w:lvlJc w:val="left"/>
+      <w:pPr>
+        <w:ind w:left="5040" w:hanging="360"/>
+      </w:pPr>
+      <w:rPr>
+        <w:rFonts w:ascii="Symbol" w:hAnsi="Symbol" w:hint="default"/>
+      </w:rPr>
+    </w:lvl>
+    <w:lvl w:ilvl="7" w:tplc="1C090003" w:tentative="1">
+      <w:start w:val="1"/>
+      <w:numFmt w:val="bullet"/>
+      <w:lvlText w:val="o"/>
+      <w:lvlJc w:val="left"/>
+      <w:pPr>
+        <w:ind w:left="5760" w:hanging="360"/>
+      </w:pPr>
+      <w:rPr>
+        <w:rFonts w:ascii="Courier New" w:hAnsi="Courier New" w:cs="Courier New" w:hint="default"/>
+      </w:rPr>
+    </w:lvl>
+    <w:lvl w:ilvl="8" w:tplc="1C090005" w:tentative="1">
+      <w:start w:val="1"/>
+      <w:numFmt w:val="bullet"/>
+      <w:lvlText w:val=""/>
+      <w:lvlJc w:val="left"/>
+      <w:pPr>
+        <w:ind w:left="6480" w:hanging="360"/>
+      </w:pPr>
+      <w:rPr>
+        <w:rFonts w:ascii="Wingdings" w:hAnsi="Wingdings" w:hint="default"/>
+      </w:rPr>
+    </w:lvl>
+  </w:abstractNum>
+  <w:abstractNum w:abstractNumId="31" w15:restartNumberingAfterBreak="0">
     <w:nsid w:val="6BED243A"/>
     <w:multiLevelType w:val="hybridMultilevel"/>
     <w:tmpl w:val="229645E8"/>
@@ -5344,7 +6730,7 @@
       </w:pPr>
     </w:lvl>
   </w:abstractNum>
-  <w:abstractNum w:abstractNumId="29" w15:restartNumberingAfterBreak="0">
+  <w:abstractNum w:abstractNumId="32" w15:restartNumberingAfterBreak="0">
     <w:nsid w:val="6CCB796B"/>
     <w:multiLevelType w:val="hybridMultilevel"/>
     <w:tmpl w:val="C3A06670"/>
@@ -5430,7 +6816,7 @@
       </w:pPr>
     </w:lvl>
   </w:abstractNum>
-  <w:abstractNum w:abstractNumId="30" w15:restartNumberingAfterBreak="0">
+  <w:abstractNum w:abstractNumId="33" w15:restartNumberingAfterBreak="0">
     <w:nsid w:val="71C90D56"/>
     <w:multiLevelType w:val="hybridMultilevel"/>
     <w:tmpl w:val="9EC80408"/>
@@ -5543,7 +6929,7 @@
       </w:rPr>
     </w:lvl>
   </w:abstractNum>
-  <w:abstractNum w:abstractNumId="31" w15:restartNumberingAfterBreak="0">
+  <w:abstractNum w:abstractNumId="34" w15:restartNumberingAfterBreak="0">
     <w:nsid w:val="71E11441"/>
     <w:multiLevelType w:val="hybridMultilevel"/>
     <w:tmpl w:val="55F64AD8"/>
@@ -5629,7 +7015,7 @@
       </w:pPr>
     </w:lvl>
   </w:abstractNum>
-  <w:abstractNum w:abstractNumId="32" w15:restartNumberingAfterBreak="0">
+  <w:abstractNum w:abstractNumId="35" w15:restartNumberingAfterBreak="0">
     <w:nsid w:val="74B05C1E"/>
     <w:multiLevelType w:val="hybridMultilevel"/>
     <w:tmpl w:val="70AC0C22"/>
@@ -5742,7 +7128,7 @@
       </w:rPr>
     </w:lvl>
   </w:abstractNum>
-  <w:abstractNum w:abstractNumId="33" w15:restartNumberingAfterBreak="0">
+  <w:abstractNum w:abstractNumId="36" w15:restartNumberingAfterBreak="0">
     <w:nsid w:val="7C300F4C"/>
     <w:multiLevelType w:val="hybridMultilevel"/>
     <w:tmpl w:val="E78A3430"/>
@@ -5828,7 +7214,7 @@
       </w:pPr>
     </w:lvl>
   </w:abstractNum>
-  <w:abstractNum w:abstractNumId="34" w15:restartNumberingAfterBreak="0">
+  <w:abstractNum w:abstractNumId="37" w15:restartNumberingAfterBreak="0">
     <w:nsid w:val="7CD30BE9"/>
     <w:multiLevelType w:val="multilevel"/>
     <w:tmpl w:val="3DA67334"/>
@@ -5942,109 +7328,118 @@
     </w:lvl>
   </w:abstractNum>
   <w:num w:numId="1" w16cid:durableId="1572232845">
+    <w:abstractNumId w:val="10"/>
+  </w:num>
+  <w:num w:numId="2" w16cid:durableId="260840514">
+    <w:abstractNumId w:val="19"/>
+  </w:num>
+  <w:num w:numId="3" w16cid:durableId="278685771">
+    <w:abstractNumId w:val="29"/>
+  </w:num>
+  <w:num w:numId="4" w16cid:durableId="262304396">
+    <w:abstractNumId w:val="14"/>
+  </w:num>
+  <w:num w:numId="5" w16cid:durableId="456223448">
+    <w:abstractNumId w:val="13"/>
+  </w:num>
+  <w:num w:numId="6" w16cid:durableId="1695380969">
+    <w:abstractNumId w:val="15"/>
+  </w:num>
+  <w:num w:numId="7" w16cid:durableId="2041663244">
+    <w:abstractNumId w:val="21"/>
+  </w:num>
+  <w:num w:numId="8" w16cid:durableId="339282339">
+    <w:abstractNumId w:val="34"/>
+  </w:num>
+  <w:num w:numId="9" w16cid:durableId="1612122887">
+    <w:abstractNumId w:val="27"/>
+  </w:num>
+  <w:num w:numId="10" w16cid:durableId="1883788689">
+    <w:abstractNumId w:val="33"/>
+  </w:num>
+  <w:num w:numId="11" w16cid:durableId="1144927608">
+    <w:abstractNumId w:val="31"/>
+  </w:num>
+  <w:num w:numId="12" w16cid:durableId="641428764">
+    <w:abstractNumId w:val="8"/>
+  </w:num>
+  <w:num w:numId="13" w16cid:durableId="1815678139">
+    <w:abstractNumId w:val="7"/>
+  </w:num>
+  <w:num w:numId="14" w16cid:durableId="1727607298">
     <w:abstractNumId w:val="9"/>
   </w:num>
-  <w:num w:numId="2" w16cid:durableId="260840514">
+  <w:num w:numId="15" w16cid:durableId="1537934351">
+    <w:abstractNumId w:val="28"/>
+  </w:num>
+  <w:num w:numId="16" w16cid:durableId="2020303686">
     <w:abstractNumId w:val="17"/>
   </w:num>
-  <w:num w:numId="3" w16cid:durableId="278685771">
-    <w:abstractNumId w:val="27"/>
+  <w:num w:numId="17" w16cid:durableId="1127045434">
+    <w:abstractNumId w:val="23"/>
   </w:num>
-  <w:num w:numId="4" w16cid:durableId="262304396">
-    <w:abstractNumId w:val="13"/>
+  <w:num w:numId="18" w16cid:durableId="1451129241">
+    <w:abstractNumId w:val="11"/>
   </w:num>
-  <w:num w:numId="5" w16cid:durableId="456223448">
-    <w:abstractNumId w:val="12"/>
-  </w:num>
-  <w:num w:numId="6" w16cid:durableId="1695380969">
-    <w:abstractNumId w:val="14"/>
-  </w:num>
-  <w:num w:numId="7" w16cid:durableId="2041663244">
-    <w:abstractNumId w:val="19"/>
-  </w:num>
-  <w:num w:numId="8" w16cid:durableId="339282339">
-    <w:abstractNumId w:val="31"/>
-  </w:num>
-  <w:num w:numId="9" w16cid:durableId="1612122887">
+  <w:num w:numId="19" w16cid:durableId="757561609">
     <w:abstractNumId w:val="25"/>
   </w:num>
-  <w:num w:numId="10" w16cid:durableId="1883788689">
-    <w:abstractNumId w:val="30"/>
-  </w:num>
-  <w:num w:numId="11" w16cid:durableId="1144927608">
-    <w:abstractNumId w:val="28"/>
-  </w:num>
-  <w:num w:numId="12" w16cid:durableId="641428764">
-    <w:abstractNumId w:val="7"/>
-  </w:num>
-  <w:num w:numId="13" w16cid:durableId="1815678139">
-    <w:abstractNumId w:val="6"/>
-  </w:num>
-  <w:num w:numId="14" w16cid:durableId="1727607298">
-    <w:abstractNumId w:val="8"/>
-  </w:num>
-  <w:num w:numId="15" w16cid:durableId="1537934351">
-    <w:abstractNumId w:val="26"/>
-  </w:num>
-  <w:num w:numId="16" w16cid:durableId="2020303686">
-    <w:abstractNumId w:val="16"/>
-  </w:num>
-  <w:num w:numId="17" w16cid:durableId="1127045434">
-    <w:abstractNumId w:val="21"/>
-  </w:num>
-  <w:num w:numId="18" w16cid:durableId="1451129241">
-    <w:abstractNumId w:val="10"/>
-  </w:num>
-  <w:num w:numId="19" w16cid:durableId="757561609">
-    <w:abstractNumId w:val="23"/>
-  </w:num>
   <w:num w:numId="20" w16cid:durableId="1934900811">
-    <w:abstractNumId w:val="3"/>
+    <w:abstractNumId w:val="4"/>
   </w:num>
   <w:num w:numId="21" w16cid:durableId="950553009">
     <w:abstractNumId w:val="2"/>
   </w:num>
   <w:num w:numId="22" w16cid:durableId="553547826">
-    <w:abstractNumId w:val="29"/>
+    <w:abstractNumId w:val="32"/>
   </w:num>
   <w:num w:numId="23" w16cid:durableId="2111510421">
     <w:abstractNumId w:val="0"/>
   </w:num>
   <w:num w:numId="24" w16cid:durableId="287056098">
-    <w:abstractNumId w:val="33"/>
+    <w:abstractNumId w:val="36"/>
   </w:num>
   <w:num w:numId="25" w16cid:durableId="449594776">
-    <w:abstractNumId w:val="4"/>
+    <w:abstractNumId w:val="5"/>
   </w:num>
   <w:num w:numId="26" w16cid:durableId="190388603">
-    <w:abstractNumId w:val="18"/>
+    <w:abstractNumId w:val="20"/>
   </w:num>
   <w:num w:numId="27" w16cid:durableId="224222431">
-    <w:abstractNumId w:val="5"/>
+    <w:abstractNumId w:val="6"/>
   </w:num>
   <w:num w:numId="28" w16cid:durableId="1158770985">
-    <w:abstractNumId w:val="11"/>
+    <w:abstractNumId w:val="12"/>
   </w:num>
   <w:num w:numId="29" w16cid:durableId="140467374">
-    <w:abstractNumId w:val="34"/>
+    <w:abstractNumId w:val="37"/>
   </w:num>
   <w:num w:numId="30" w16cid:durableId="191843358">
-    <w:abstractNumId w:val="20"/>
+    <w:abstractNumId w:val="22"/>
   </w:num>
   <w:num w:numId="31" w16cid:durableId="1480226956">
+    <w:abstractNumId w:val="26"/>
+  </w:num>
+  <w:num w:numId="32" w16cid:durableId="1719739054">
+    <w:abstractNumId w:val="16"/>
+  </w:num>
+  <w:num w:numId="33" w16cid:durableId="2016808161">
     <w:abstractNumId w:val="24"/>
   </w:num>
-  <w:num w:numId="32" w16cid:durableId="1719739054">
-    <w:abstractNumId w:val="15"/>
-  </w:num>
-  <w:num w:numId="33" w16cid:durableId="2016808161">
-    <w:abstractNumId w:val="22"/>
-  </w:num>
   <w:num w:numId="34" w16cid:durableId="1412922212">
-    <w:abstractNumId w:val="32"/>
+    <w:abstractNumId w:val="35"/>
   </w:num>
   <w:num w:numId="35" w16cid:durableId="1433472894">
     <w:abstractNumId w:val="1"/>
+  </w:num>
+  <w:num w:numId="36" w16cid:durableId="207228947">
+    <w:abstractNumId w:val="30"/>
+  </w:num>
+  <w:num w:numId="37" w16cid:durableId="242450006">
+    <w:abstractNumId w:val="3"/>
+  </w:num>
+  <w:num w:numId="38" w16cid:durableId="1494297340">
+    <w:abstractNumId w:val="18"/>
   </w:num>
 </w:numbering>
 </file>
@@ -6548,7 +7943,6 @@
   <w:style w:type="character" w:default="1" w:styleId="DefaultParagraphFont">
     <w:name w:val="Default Paragraph Font"/>
     <w:uiPriority w:val="1"/>
-    <w:semiHidden/>
     <w:unhideWhenUsed/>
   </w:style>
   <w:style w:type="table" w:default="1" w:styleId="TableNormal">

</xml_diff>